<commit_message>
docs: lengkapi dan rapikan tabel identitas naskah Apresiasi GTK 2026
</commit_message>
<xml_diff>
--- a/lab/doc/20260930 - Apresiasi GTK 2026/Naskah Apresiasi GTK 2026 - Inovasi Pembelajaran -  Fanani - Lamongan.docx
+++ b/lab/doc/20260930 - Apresiasi GTK 2026/Naskah Apresiasi GTK 2026 - Inovasi Pembelajaran -  Fanani - Lamongan.docx
@@ -55,19 +55,20 @@
     <w:tbl>
       <w:tblPr>
         <w:tblW w:w="7938" w:type="dxa"/>
-        <w:tblBorders>
-          <w:top w:val="single" w:sz="4" w:space="0" w:color="auto"/>
-          <w:left w:val="single" w:sz="4" w:space="0" w:color="auto"/>
-          <w:bottom w:val="single" w:sz="4" w:space="0" w:color="auto"/>
-          <w:right w:val="single" w:sz="4" w:space="0" w:color="auto"/>
-          <w:insideH w:val="single" w:sz="4" w:space="0" w:color="auto"/>
-          <w:insideV w:val="single" w:sz="4" w:space="0" w:color="auto"/>
-        </w:tblBorders>
+        <w:jc w:val="center"/>
         <w:tblCellMar>
           <w:left w:w="10" w:type="dxa"/>
           <w:right w:w="10" w:type="dxa"/>
         </w:tblCellMar>
         <w:tblLook w:val="04A0" w:firstRow="1" w:lastRow="0" w:firstColumn="1" w:lastColumn="0" w:noHBand="0" w:noVBand="1"/>
+        <w:tblBorders>
+          <w:top w:val="single" w:sz="6" w:space="0" w:color="94A3B8"/>
+          <w:left w:val="none"/>
+          <w:bottom w:val="single" w:sz="6" w:space="0" w:color="94A3B8"/>
+          <w:right w:val="none"/>
+          <w:insideH w:val="single" w:sz="4" w:space="0" w:color="E2E8F0"/>
+          <w:insideV w:val="none"/>
+        </w:tblBorders>
       </w:tblPr>
       <w:tblGrid>
         <w:gridCol w:w="2400"/>
@@ -76,7 +77,7 @@
       <w:tr>
         <w:tc>
           <w:tcPr>
-            <w:tcW w:w="2400" w:type="dxa"/>
+            <w:tcW w:w="2381" w:type="dxa"/>
             <w:tcBorders>
               <w:top w:val="single" w:sz="4" w:space="0" w:color="808080"/>
               <w:left w:val="single" w:sz="4" w:space="0" w:color="808080"/>
@@ -90,12 +91,31 @@
               <w:bottom w:w="50" w:type="dxa"/>
               <w:right w:w="100" w:type="dxa"/>
             </w:tcMar>
+            <w:tcBorders>
+              <w:top w:val="single" w:sz="4" w:space="0" w:color="CCCCCC"/>
+              <w:left w:val="single" w:sz="4" w:space="0" w:color="CCCCCC"/>
+              <w:bottom w:val="single" w:sz="4" w:space="0" w:color="CCCCCC"/>
+              <w:right w:val="single" w:sz="4" w:space="0" w:color="CCCCCC"/>
+            </w:tcBorders>
+            <w:tcMar>
+              <w:top w:w="110" w:type="dxa"/>
+              <w:bottom w:w="110" w:type="dxa"/>
+              <w:left w:w="160" w:type="dxa"/>
+              <w:right w:w="140" w:type="dxa"/>
+            </w:tcMar>
+            <w:shd w:fill="F3F4F6"/>
           </w:tcPr>
           <w:p>
+            <w:pPr>
+              <w:spacing w:line="276" w:lineRule="auto" w:before="0" w:after="0"/>
+            </w:pPr>
+            <w:r/>
             <w:r>
               <w:rPr>
+                <w:rFonts w:ascii="Times New Roman" w:hAnsi="Times New Roman"/>
                 <w:b/>
-                <w:bCs/>
+                <w:color w:val="1E293B"/>
+                <w:sz w:val="21"/>
               </w:rPr>
               <w:t>Nama Lengkap</w:t>
             </w:r>
@@ -103,7 +123,7 @@
         </w:tc>
         <w:tc>
           <w:tcPr>
-            <w:tcW w:w="5538" w:type="dxa"/>
+            <w:tcW w:w="5556" w:type="dxa"/>
             <w:tcBorders>
               <w:top w:val="single" w:sz="4" w:space="0" w:color="808080"/>
               <w:left w:val="single" w:sz="4" w:space="0" w:color="808080"/>
@@ -116,9 +136,31 @@
               <w:bottom w:w="50" w:type="dxa"/>
               <w:right w:w="100" w:type="dxa"/>
             </w:tcMar>
+            <w:tcBorders>
+              <w:top w:val="single" w:sz="4" w:space="0" w:color="CCCCCC"/>
+              <w:left w:val="single" w:sz="4" w:space="0" w:color="CCCCCC"/>
+              <w:bottom w:val="single" w:sz="4" w:space="0" w:color="CCCCCC"/>
+              <w:right w:val="single" w:sz="4" w:space="0" w:color="CCCCCC"/>
+            </w:tcBorders>
+            <w:tcMar>
+              <w:top w:w="110" w:type="dxa"/>
+              <w:bottom w:w="110" w:type="dxa"/>
+              <w:left w:w="160" w:type="dxa"/>
+              <w:right w:w="140" w:type="dxa"/>
+            </w:tcMar>
+            <w:shd w:fill="FFFFFF"/>
           </w:tcPr>
           <w:p>
+            <w:pPr>
+              <w:spacing w:line="276" w:lineRule="auto" w:before="0" w:after="0"/>
+            </w:pPr>
+            <w:r/>
             <w:r>
+              <w:rPr>
+                <w:rFonts w:ascii="Times New Roman" w:hAnsi="Times New Roman"/>
+                <w:color w:val="0F172A"/>
+                <w:sz w:val="21"/>
+              </w:rPr>
               <w:t>Ach. Chanifuddin Fanani, S.Pd.</w:t>
             </w:r>
           </w:p>
@@ -127,7 +169,7 @@
       <w:tr>
         <w:tc>
           <w:tcPr>
-            <w:tcW w:w="2400" w:type="dxa"/>
+            <w:tcW w:w="2381" w:type="dxa"/>
             <w:tcBorders>
               <w:top w:val="single" w:sz="4" w:space="0" w:color="808080"/>
               <w:left w:val="single" w:sz="4" w:space="0" w:color="808080"/>
@@ -141,20 +183,39 @@
               <w:bottom w:w="50" w:type="dxa"/>
               <w:right w:w="100" w:type="dxa"/>
             </w:tcMar>
+            <w:tcBorders>
+              <w:top w:val="single" w:sz="4" w:space="0" w:color="CCCCCC"/>
+              <w:left w:val="single" w:sz="4" w:space="0" w:color="CCCCCC"/>
+              <w:bottom w:val="single" w:sz="4" w:space="0" w:color="CCCCCC"/>
+              <w:right w:val="single" w:sz="4" w:space="0" w:color="CCCCCC"/>
+            </w:tcBorders>
+            <w:tcMar>
+              <w:top w:w="110" w:type="dxa"/>
+              <w:bottom w:w="110" w:type="dxa"/>
+              <w:left w:w="160" w:type="dxa"/>
+              <w:right w:w="140" w:type="dxa"/>
+            </w:tcMar>
+            <w:shd w:fill="F3F4F6"/>
           </w:tcPr>
           <w:p>
+            <w:pPr>
+              <w:spacing w:line="276" w:lineRule="auto" w:before="0" w:after="0"/>
+            </w:pPr>
+            <w:r/>
             <w:r>
               <w:rPr>
+                <w:rFonts w:ascii="Times New Roman" w:hAnsi="Times New Roman"/>
                 <w:b/>
-                <w:bCs/>
+                <w:color w:val="1E293B"/>
+                <w:sz w:val="21"/>
               </w:rPr>
-              <w:t>Sekolah</w:t>
+              <w:t>NIP</w:t>
             </w:r>
           </w:p>
         </w:tc>
         <w:tc>
           <w:tcPr>
-            <w:tcW w:w="5538" w:type="dxa"/>
+            <w:tcW w:w="5556" w:type="dxa"/>
             <w:tcBorders>
               <w:top w:val="single" w:sz="4" w:space="0" w:color="808080"/>
               <w:left w:val="single" w:sz="4" w:space="0" w:color="808080"/>
@@ -167,14 +228,32 @@
               <w:bottom w:w="50" w:type="dxa"/>
               <w:right w:w="100" w:type="dxa"/>
             </w:tcMar>
+            <w:tcBorders>
+              <w:top w:val="single" w:sz="4" w:space="0" w:color="CCCCCC"/>
+              <w:left w:val="single" w:sz="4" w:space="0" w:color="CCCCCC"/>
+              <w:bottom w:val="single" w:sz="4" w:space="0" w:color="CCCCCC"/>
+              <w:right w:val="single" w:sz="4" w:space="0" w:color="CCCCCC"/>
+            </w:tcBorders>
+            <w:tcMar>
+              <w:top w:w="110" w:type="dxa"/>
+              <w:bottom w:w="110" w:type="dxa"/>
+              <w:left w:w="160" w:type="dxa"/>
+              <w:right w:w="140" w:type="dxa"/>
+            </w:tcMar>
+            <w:shd w:fill="FAFAFA"/>
           </w:tcPr>
           <w:p>
+            <w:pPr>
+              <w:spacing w:line="276" w:lineRule="auto" w:before="0" w:after="0"/>
+            </w:pPr>
+            <w:r/>
             <w:r>
-              <w:t xml:space="preserve">SMP Negeri 2 Lamongan, </w:t>
-            </w:r>
-            <w:r>
-              <w:br/>
-              <w:t>Kabupaten Lamongan, Jawa Timur</w:t>
+              <w:rPr>
+                <w:rFonts w:ascii="Times New Roman" w:hAnsi="Times New Roman"/>
+                <w:color w:val="0F172A"/>
+                <w:sz w:val="21"/>
+              </w:rPr>
+              <w:t>19910826 202012 1 007</w:t>
             </w:r>
           </w:p>
         </w:tc>
@@ -182,7 +261,7 @@
       <w:tr>
         <w:tc>
           <w:tcPr>
-            <w:tcW w:w="2400" w:type="dxa"/>
+            <w:tcW w:w="2381" w:type="dxa"/>
             <w:tcBorders>
               <w:top w:val="single" w:sz="4" w:space="0" w:color="808080"/>
               <w:left w:val="single" w:sz="4" w:space="0" w:color="808080"/>
@@ -196,20 +275,39 @@
               <w:bottom w:w="50" w:type="dxa"/>
               <w:right w:w="100" w:type="dxa"/>
             </w:tcMar>
+            <w:tcBorders>
+              <w:top w:val="single" w:sz="4" w:space="0" w:color="CCCCCC"/>
+              <w:left w:val="single" w:sz="4" w:space="0" w:color="CCCCCC"/>
+              <w:bottom w:val="single" w:sz="4" w:space="0" w:color="CCCCCC"/>
+              <w:right w:val="single" w:sz="4" w:space="0" w:color="CCCCCC"/>
+            </w:tcBorders>
+            <w:tcMar>
+              <w:top w:w="110" w:type="dxa"/>
+              <w:bottom w:w="110" w:type="dxa"/>
+              <w:left w:w="160" w:type="dxa"/>
+              <w:right w:w="140" w:type="dxa"/>
+            </w:tcMar>
+            <w:shd w:fill="F3F4F6"/>
           </w:tcPr>
           <w:p>
+            <w:pPr>
+              <w:spacing w:line="276" w:lineRule="auto" w:before="0" w:after="0"/>
+            </w:pPr>
+            <w:r/>
             <w:r>
               <w:rPr>
+                <w:rFonts w:ascii="Times New Roman" w:hAnsi="Times New Roman"/>
                 <w:b/>
-                <w:bCs/>
+                <w:color w:val="1E293B"/>
+                <w:sz w:val="21"/>
               </w:rPr>
-              <w:t>Mata Pelajaran</w:t>
+              <w:t>NUPTK</w:t>
             </w:r>
           </w:p>
         </w:tc>
         <w:tc>
           <w:tcPr>
-            <w:tcW w:w="5538" w:type="dxa"/>
+            <w:tcW w:w="5556" w:type="dxa"/>
             <w:tcBorders>
               <w:top w:val="single" w:sz="4" w:space="0" w:color="808080"/>
               <w:left w:val="single" w:sz="4" w:space="0" w:color="808080"/>
@@ -222,10 +320,32 @@
               <w:bottom w:w="50" w:type="dxa"/>
               <w:right w:w="100" w:type="dxa"/>
             </w:tcMar>
+            <w:tcBorders>
+              <w:top w:val="single" w:sz="4" w:space="0" w:color="CCCCCC"/>
+              <w:left w:val="single" w:sz="4" w:space="0" w:color="CCCCCC"/>
+              <w:bottom w:val="single" w:sz="4" w:space="0" w:color="CCCCCC"/>
+              <w:right w:val="single" w:sz="4" w:space="0" w:color="CCCCCC"/>
+            </w:tcBorders>
+            <w:tcMar>
+              <w:top w:w="110" w:type="dxa"/>
+              <w:bottom w:w="110" w:type="dxa"/>
+              <w:left w:w="160" w:type="dxa"/>
+              <w:right w:w="140" w:type="dxa"/>
+            </w:tcMar>
+            <w:shd w:fill="FFFFFF"/>
           </w:tcPr>
           <w:p>
+            <w:pPr>
+              <w:spacing w:line="276" w:lineRule="auto" w:before="0" w:after="0"/>
+            </w:pPr>
+            <w:r/>
             <w:r>
-              <w:t>Informatika / SMP Fase D</w:t>
+              <w:rPr>
+                <w:rFonts w:ascii="Times New Roman" w:hAnsi="Times New Roman"/>
+                <w:color w:val="0F172A"/>
+                <w:sz w:val="21"/>
+              </w:rPr>
+              <w:t>9158 7696 7013 0183</w:t>
             </w:r>
           </w:p>
         </w:tc>
@@ -233,7 +353,7 @@
       <w:tr>
         <w:tc>
           <w:tcPr>
-            <w:tcW w:w="2400" w:type="dxa"/>
+            <w:tcW w:w="2381" w:type="dxa"/>
             <w:tcBorders>
               <w:top w:val="single" w:sz="4" w:space="0" w:color="808080"/>
               <w:left w:val="single" w:sz="4" w:space="0" w:color="808080"/>
@@ -247,12 +367,699 @@
               <w:bottom w:w="50" w:type="dxa"/>
               <w:right w:w="100" w:type="dxa"/>
             </w:tcMar>
+            <w:tcBorders>
+              <w:top w:val="single" w:sz="4" w:space="0" w:color="CCCCCC"/>
+              <w:left w:val="single" w:sz="4" w:space="0" w:color="CCCCCC"/>
+              <w:bottom w:val="single" w:sz="4" w:space="0" w:color="CCCCCC"/>
+              <w:right w:val="single" w:sz="4" w:space="0" w:color="CCCCCC"/>
+            </w:tcBorders>
+            <w:tcMar>
+              <w:top w:w="110" w:type="dxa"/>
+              <w:bottom w:w="110" w:type="dxa"/>
+              <w:left w:w="160" w:type="dxa"/>
+              <w:right w:w="140" w:type="dxa"/>
+            </w:tcMar>
+            <w:shd w:fill="F3F4F6"/>
           </w:tcPr>
           <w:p>
+            <w:pPr>
+              <w:spacing w:line="276" w:lineRule="auto" w:before="0" w:after="0"/>
+            </w:pPr>
+            <w:r/>
             <w:r>
               <w:rPr>
+                <w:rFonts w:ascii="Times New Roman" w:hAnsi="Times New Roman"/>
                 <w:b/>
-                <w:bCs/>
+                <w:color w:val="1E293B"/>
+                <w:sz w:val="21"/>
+              </w:rPr>
+              <w:t>Jabatan / Kategori</w:t>
+            </w:r>
+          </w:p>
+        </w:tc>
+        <w:tc>
+          <w:tcPr>
+            <w:tcW w:w="5556" w:type="dxa"/>
+            <w:tcBorders>
+              <w:top w:val="single" w:sz="4" w:space="0" w:color="808080"/>
+              <w:left w:val="single" w:sz="4" w:space="0" w:color="808080"/>
+              <w:bottom w:val="single" w:sz="4" w:space="0" w:color="808080"/>
+              <w:right w:val="single" w:sz="4" w:space="0" w:color="808080"/>
+            </w:tcBorders>
+            <w:tcMar>
+              <w:top w:w="50" w:type="dxa"/>
+              <w:left w:w="100" w:type="dxa"/>
+              <w:bottom w:w="50" w:type="dxa"/>
+              <w:right w:w="100" w:type="dxa"/>
+            </w:tcMar>
+            <w:tcBorders>
+              <w:top w:val="single" w:sz="4" w:space="0" w:color="CCCCCC"/>
+              <w:left w:val="single" w:sz="4" w:space="0" w:color="CCCCCC"/>
+              <w:bottom w:val="single" w:sz="4" w:space="0" w:color="CCCCCC"/>
+              <w:right w:val="single" w:sz="4" w:space="0" w:color="CCCCCC"/>
+            </w:tcBorders>
+            <w:tcMar>
+              <w:top w:w="110" w:type="dxa"/>
+              <w:bottom w:w="110" w:type="dxa"/>
+              <w:left w:w="160" w:type="dxa"/>
+              <w:right w:w="140" w:type="dxa"/>
+            </w:tcMar>
+            <w:shd w:fill="FAFAFA"/>
+          </w:tcPr>
+          <w:p>
+            <w:pPr>
+              <w:spacing w:line="276" w:lineRule="auto" w:before="0" w:after="0"/>
+            </w:pPr>
+            <w:r/>
+            <w:r>
+              <w:rPr>
+                <w:rFonts w:ascii="Times New Roman" w:hAnsi="Times New Roman"/>
+                <w:color w:val="0F172A"/>
+                <w:sz w:val="21"/>
+              </w:rPr>
+              <w:t>Guru SMP Transformatif</w:t>
+            </w:r>
+          </w:p>
+        </w:tc>
+      </w:tr>
+      <w:tr>
+        <w:tc>
+          <w:tcPr>
+            <w:tcW w:w="2381" w:type="dxa"/>
+            <w:tcBorders>
+              <w:top w:val="single" w:sz="4" w:space="0" w:color="808080"/>
+              <w:left w:val="single" w:sz="4" w:space="0" w:color="808080"/>
+              <w:bottom w:val="single" w:sz="4" w:space="0" w:color="808080"/>
+              <w:right w:val="single" w:sz="4" w:space="0" w:color="808080"/>
+            </w:tcBorders>
+            <w:shd w:val="clear" w:color="auto" w:fill="F2F2F2"/>
+            <w:tcMar>
+              <w:top w:w="50" w:type="dxa"/>
+              <w:left w:w="100" w:type="dxa"/>
+              <w:bottom w:w="50" w:type="dxa"/>
+              <w:right w:w="100" w:type="dxa"/>
+            </w:tcMar>
+            <w:tcBorders>
+              <w:top w:val="single" w:sz="4" w:space="0" w:color="CCCCCC"/>
+              <w:left w:val="single" w:sz="4" w:space="0" w:color="CCCCCC"/>
+              <w:bottom w:val="single" w:sz="4" w:space="0" w:color="CCCCCC"/>
+              <w:right w:val="single" w:sz="4" w:space="0" w:color="CCCCCC"/>
+            </w:tcBorders>
+            <w:tcMar>
+              <w:top w:w="110" w:type="dxa"/>
+              <w:bottom w:w="110" w:type="dxa"/>
+              <w:left w:w="160" w:type="dxa"/>
+              <w:right w:w="140" w:type="dxa"/>
+            </w:tcMar>
+            <w:shd w:fill="F3F4F6"/>
+          </w:tcPr>
+          <w:p>
+            <w:pPr>
+              <w:spacing w:line="276" w:lineRule="auto" w:before="0" w:after="0"/>
+            </w:pPr>
+            <w:r/>
+            <w:r>
+              <w:rPr>
+                <w:rFonts w:ascii="Times New Roman" w:hAnsi="Times New Roman"/>
+                <w:b/>
+                <w:color w:val="1E293B"/>
+                <w:sz w:val="21"/>
+              </w:rPr>
+              <w:t>Tema Inovasi</w:t>
+            </w:r>
+          </w:p>
+        </w:tc>
+        <w:tc>
+          <w:tcPr>
+            <w:tcW w:w="5556" w:type="dxa"/>
+            <w:tcBorders>
+              <w:top w:val="single" w:sz="4" w:space="0" w:color="808080"/>
+              <w:left w:val="single" w:sz="4" w:space="0" w:color="808080"/>
+              <w:bottom w:val="single" w:sz="4" w:space="0" w:color="808080"/>
+              <w:right w:val="single" w:sz="4" w:space="0" w:color="808080"/>
+            </w:tcBorders>
+            <w:tcMar>
+              <w:top w:w="50" w:type="dxa"/>
+              <w:left w:w="100" w:type="dxa"/>
+              <w:bottom w:w="50" w:type="dxa"/>
+              <w:right w:w="100" w:type="dxa"/>
+            </w:tcMar>
+            <w:tcBorders>
+              <w:top w:val="single" w:sz="4" w:space="0" w:color="CCCCCC"/>
+              <w:left w:val="single" w:sz="4" w:space="0" w:color="CCCCCC"/>
+              <w:bottom w:val="single" w:sz="4" w:space="0" w:color="CCCCCC"/>
+              <w:right w:val="single" w:sz="4" w:space="0" w:color="CCCCCC"/>
+            </w:tcBorders>
+            <w:tcMar>
+              <w:top w:w="110" w:type="dxa"/>
+              <w:bottom w:w="110" w:type="dxa"/>
+              <w:left w:w="160" w:type="dxa"/>
+              <w:right w:w="140" w:type="dxa"/>
+            </w:tcMar>
+            <w:shd w:fill="FFFFFF"/>
+          </w:tcPr>
+          <w:p>
+            <w:pPr>
+              <w:spacing w:line="276" w:lineRule="auto" w:before="0" w:after="0"/>
+            </w:pPr>
+            <w:r/>
+            <w:r>
+              <w:rPr>
+                <w:rFonts w:ascii="Times New Roman" w:hAnsi="Times New Roman"/>
+                <w:color w:val="0F172A"/>
+                <w:sz w:val="21"/>
+              </w:rPr>
+              <w:t>Inovasi Pembelajaran</w:t>
+            </w:r>
+          </w:p>
+        </w:tc>
+      </w:tr>
+      <w:tr>
+        <w:tc>
+          <w:tcPr>
+            <w:tcW w:w="2381" w:type="dxa"/>
+            <w:tcBorders>
+              <w:top w:val="single" w:sz="4" w:space="0" w:color="808080"/>
+              <w:left w:val="single" w:sz="4" w:space="0" w:color="808080"/>
+              <w:bottom w:val="single" w:sz="4" w:space="0" w:color="808080"/>
+              <w:right w:val="single" w:sz="4" w:space="0" w:color="808080"/>
+            </w:tcBorders>
+            <w:shd w:val="clear" w:color="auto" w:fill="F2F2F2"/>
+            <w:tcMar>
+              <w:top w:w="50" w:type="dxa"/>
+              <w:left w:w="100" w:type="dxa"/>
+              <w:bottom w:w="50" w:type="dxa"/>
+              <w:right w:w="100" w:type="dxa"/>
+            </w:tcMar>
+            <w:tcBorders>
+              <w:top w:val="single" w:sz="4" w:space="0" w:color="CCCCCC"/>
+              <w:left w:val="single" w:sz="4" w:space="0" w:color="CCCCCC"/>
+              <w:bottom w:val="single" w:sz="4" w:space="0" w:color="CCCCCC"/>
+              <w:right w:val="single" w:sz="4" w:space="0" w:color="CCCCCC"/>
+            </w:tcBorders>
+            <w:tcMar>
+              <w:top w:w="110" w:type="dxa"/>
+              <w:bottom w:w="110" w:type="dxa"/>
+              <w:left w:w="160" w:type="dxa"/>
+              <w:right w:w="140" w:type="dxa"/>
+            </w:tcMar>
+            <w:shd w:fill="F3F4F6"/>
+          </w:tcPr>
+          <w:p>
+            <w:pPr>
+              <w:spacing w:line="276" w:lineRule="auto" w:before="0" w:after="0"/>
+            </w:pPr>
+            <w:r/>
+            <w:r>
+              <w:rPr>
+                <w:rFonts w:ascii="Times New Roman" w:hAnsi="Times New Roman"/>
+                <w:b/>
+                <w:color w:val="1E293B"/>
+                <w:sz w:val="21"/>
+              </w:rPr>
+              <w:t>Satuan Pendidikan</w:t>
+            </w:r>
+          </w:p>
+        </w:tc>
+        <w:tc>
+          <w:tcPr>
+            <w:tcW w:w="5556" w:type="dxa"/>
+            <w:tcBorders>
+              <w:top w:val="single" w:sz="4" w:space="0" w:color="808080"/>
+              <w:left w:val="single" w:sz="4" w:space="0" w:color="808080"/>
+              <w:bottom w:val="single" w:sz="4" w:space="0" w:color="808080"/>
+              <w:right w:val="single" w:sz="4" w:space="0" w:color="808080"/>
+            </w:tcBorders>
+            <w:tcMar>
+              <w:top w:w="50" w:type="dxa"/>
+              <w:left w:w="100" w:type="dxa"/>
+              <w:bottom w:w="50" w:type="dxa"/>
+              <w:right w:w="100" w:type="dxa"/>
+            </w:tcMar>
+            <w:tcBorders>
+              <w:top w:val="single" w:sz="4" w:space="0" w:color="CCCCCC"/>
+              <w:left w:val="single" w:sz="4" w:space="0" w:color="CCCCCC"/>
+              <w:bottom w:val="single" w:sz="4" w:space="0" w:color="CCCCCC"/>
+              <w:right w:val="single" w:sz="4" w:space="0" w:color="CCCCCC"/>
+            </w:tcBorders>
+            <w:tcMar>
+              <w:top w:w="110" w:type="dxa"/>
+              <w:bottom w:w="110" w:type="dxa"/>
+              <w:left w:w="160" w:type="dxa"/>
+              <w:right w:w="140" w:type="dxa"/>
+            </w:tcMar>
+            <w:shd w:fill="FAFAFA"/>
+          </w:tcPr>
+          <w:p>
+            <w:pPr>
+              <w:spacing w:line="276" w:lineRule="auto" w:before="0" w:after="0"/>
+            </w:pPr>
+            <w:r/>
+            <w:r>
+              <w:rPr>
+                <w:rFonts w:ascii="Times New Roman" w:hAnsi="Times New Roman"/>
+                <w:color w:val="0F172A"/>
+                <w:sz w:val="21"/>
+              </w:rPr>
+              <w:t>SMP Negeri 2 Lamongan</w:t>
+            </w:r>
+          </w:p>
+        </w:tc>
+      </w:tr>
+      <w:tr>
+        <w:tc>
+          <w:tcPr>
+            <w:tcW w:type="dxa" w:w="2381"/>
+            <w:tcBorders>
+              <w:top w:val="single" w:sz="4" w:space="0" w:color="CCCCCC"/>
+              <w:left w:val="single" w:sz="4" w:space="0" w:color="CCCCCC"/>
+              <w:bottom w:val="single" w:sz="4" w:space="0" w:color="CCCCCC"/>
+              <w:right w:val="single" w:sz="4" w:space="0" w:color="CCCCCC"/>
+            </w:tcBorders>
+            <w:tcMar>
+              <w:top w:w="110" w:type="dxa"/>
+              <w:bottom w:w="110" w:type="dxa"/>
+              <w:left w:w="160" w:type="dxa"/>
+              <w:right w:w="140" w:type="dxa"/>
+            </w:tcMar>
+            <w:shd w:fill="F3F4F6"/>
+          </w:tcPr>
+          <w:p>
+            <w:pPr>
+              <w:spacing w:line="276" w:lineRule="auto" w:before="0" w:after="0"/>
+            </w:pPr>
+            <w:r/>
+            <w:r>
+              <w:rPr>
+                <w:rFonts w:ascii="Times New Roman" w:hAnsi="Times New Roman"/>
+                <w:b/>
+                <w:color w:val="1E293B"/>
+                <w:sz w:val="21"/>
+              </w:rPr>
+              <w:t>Alamat Satuan Pendidikan</w:t>
+            </w:r>
+          </w:p>
+        </w:tc>
+        <w:tc>
+          <w:tcPr>
+            <w:tcW w:type="dxa" w:w="5556"/>
+            <w:tcBorders>
+              <w:top w:val="single" w:sz="4" w:space="0" w:color="CCCCCC"/>
+              <w:left w:val="single" w:sz="4" w:space="0" w:color="CCCCCC"/>
+              <w:bottom w:val="single" w:sz="4" w:space="0" w:color="CCCCCC"/>
+              <w:right w:val="single" w:sz="4" w:space="0" w:color="CCCCCC"/>
+            </w:tcBorders>
+            <w:tcMar>
+              <w:top w:w="110" w:type="dxa"/>
+              <w:bottom w:w="110" w:type="dxa"/>
+              <w:left w:w="160" w:type="dxa"/>
+              <w:right w:w="140" w:type="dxa"/>
+            </w:tcMar>
+            <w:shd w:fill="FFFFFF"/>
+          </w:tcPr>
+          <w:p>
+            <w:pPr>
+              <w:spacing w:line="276" w:lineRule="auto" w:before="0" w:after="0"/>
+            </w:pPr>
+            <w:r/>
+            <w:r>
+              <w:rPr>
+                <w:rFonts w:ascii="Times New Roman" w:hAnsi="Times New Roman"/>
+                <w:color w:val="0F172A"/>
+                <w:sz w:val="21"/>
+              </w:rPr>
+              <w:t>Jl. Veteran No. 3, Kel. Banjarmendalan, Kec. Lamongan, Kab. Lamongan, Jawa Timur 62212</w:t>
+            </w:r>
+          </w:p>
+        </w:tc>
+      </w:tr>
+      <w:tr>
+        <w:tc>
+          <w:tcPr>
+            <w:tcW w:type="dxa" w:w="2381"/>
+            <w:tcBorders>
+              <w:top w:val="single" w:sz="4" w:space="0" w:color="CCCCCC"/>
+              <w:left w:val="single" w:sz="4" w:space="0" w:color="CCCCCC"/>
+              <w:bottom w:val="single" w:sz="4" w:space="0" w:color="CCCCCC"/>
+              <w:right w:val="single" w:sz="4" w:space="0" w:color="CCCCCC"/>
+            </w:tcBorders>
+            <w:tcMar>
+              <w:top w:w="110" w:type="dxa"/>
+              <w:bottom w:w="110" w:type="dxa"/>
+              <w:left w:w="160" w:type="dxa"/>
+              <w:right w:w="140" w:type="dxa"/>
+            </w:tcMar>
+            <w:shd w:fill="F3F4F6"/>
+          </w:tcPr>
+          <w:p>
+            <w:pPr>
+              <w:spacing w:line="276" w:lineRule="auto" w:before="0" w:after="0"/>
+            </w:pPr>
+            <w:r/>
+            <w:r>
+              <w:rPr>
+                <w:rFonts w:ascii="Times New Roman" w:hAnsi="Times New Roman"/>
+                <w:b/>
+                <w:color w:val="1E293B"/>
+                <w:sz w:val="21"/>
+              </w:rPr>
+              <w:t>Mata Pelajaran / Sasaran</w:t>
+            </w:r>
+          </w:p>
+        </w:tc>
+        <w:tc>
+          <w:tcPr>
+            <w:tcW w:type="dxa" w:w="5556"/>
+            <w:tcBorders>
+              <w:top w:val="single" w:sz="4" w:space="0" w:color="CCCCCC"/>
+              <w:left w:val="single" w:sz="4" w:space="0" w:color="CCCCCC"/>
+              <w:bottom w:val="single" w:sz="4" w:space="0" w:color="CCCCCC"/>
+              <w:right w:val="single" w:sz="4" w:space="0" w:color="CCCCCC"/>
+            </w:tcBorders>
+            <w:tcMar>
+              <w:top w:w="110" w:type="dxa"/>
+              <w:bottom w:w="110" w:type="dxa"/>
+              <w:left w:w="160" w:type="dxa"/>
+              <w:right w:w="140" w:type="dxa"/>
+            </w:tcMar>
+            <w:shd w:fill="FAFAFA"/>
+          </w:tcPr>
+          <w:p>
+            <w:pPr>
+              <w:spacing w:line="276" w:lineRule="auto" w:before="0" w:after="0"/>
+            </w:pPr>
+            <w:r/>
+            <w:r>
+              <w:rPr>
+                <w:rFonts w:ascii="Times New Roman" w:hAnsi="Times New Roman"/>
+                <w:color w:val="0F172A"/>
+                <w:sz w:val="21"/>
+              </w:rPr>
+              <w:t>Informatika / Fase D (Kelas IX)</w:t>
+            </w:r>
+          </w:p>
+        </w:tc>
+      </w:tr>
+      <w:tr>
+        <w:tc>
+          <w:tcPr>
+            <w:tcW w:type="dxa" w:w="2381"/>
+            <w:tcBorders>
+              <w:top w:val="single" w:sz="4" w:space="0" w:color="CCCCCC"/>
+              <w:left w:val="single" w:sz="4" w:space="0" w:color="CCCCCC"/>
+              <w:bottom w:val="single" w:sz="4" w:space="0" w:color="CCCCCC"/>
+              <w:right w:val="single" w:sz="4" w:space="0" w:color="CCCCCC"/>
+            </w:tcBorders>
+            <w:tcMar>
+              <w:top w:w="110" w:type="dxa"/>
+              <w:bottom w:w="110" w:type="dxa"/>
+              <w:left w:w="160" w:type="dxa"/>
+              <w:right w:w="140" w:type="dxa"/>
+            </w:tcMar>
+            <w:shd w:fill="F3F4F6"/>
+          </w:tcPr>
+          <w:p>
+            <w:pPr>
+              <w:spacing w:line="276" w:lineRule="auto" w:before="0" w:after="0"/>
+            </w:pPr>
+            <w:r/>
+            <w:r>
+              <w:rPr>
+                <w:rFonts w:ascii="Times New Roman" w:hAnsi="Times New Roman"/>
+                <w:b/>
+                <w:color w:val="1E293B"/>
+                <w:sz w:val="21"/>
+              </w:rPr>
+              <w:t>Judul Karya Inovasi</w:t>
+            </w:r>
+          </w:p>
+        </w:tc>
+        <w:tc>
+          <w:tcPr>
+            <w:tcW w:type="dxa" w:w="5556"/>
+            <w:tcBorders>
+              <w:top w:val="single" w:sz="4" w:space="0" w:color="CCCCCC"/>
+              <w:left w:val="single" w:sz="4" w:space="0" w:color="CCCCCC"/>
+              <w:bottom w:val="single" w:sz="4" w:space="0" w:color="CCCCCC"/>
+              <w:right w:val="single" w:sz="4" w:space="0" w:color="CCCCCC"/>
+            </w:tcBorders>
+            <w:tcMar>
+              <w:top w:w="110" w:type="dxa"/>
+              <w:bottom w:w="110" w:type="dxa"/>
+              <w:left w:w="160" w:type="dxa"/>
+              <w:right w:w="140" w:type="dxa"/>
+            </w:tcMar>
+            <w:shd w:fill="FFFFFF"/>
+          </w:tcPr>
+          <w:p>
+            <w:pPr>
+              <w:spacing w:line="276" w:lineRule="auto" w:before="0" w:after="0"/>
+            </w:pPr>
+            <w:r/>
+            <w:r>
+              <w:rPr>
+                <w:rFonts w:ascii="Times New Roman" w:hAnsi="Times New Roman"/>
+                <w:color w:val="0F172A"/>
+                <w:sz w:val="21"/>
+              </w:rPr>
+              <w:t>Menyelam ke Dalam Mesin Digital: Inovasi Media Pembelajaran Interaktif Sistem Komputer Berbasis Web di SMP Negeri 2 Lamongan</w:t>
+            </w:r>
+          </w:p>
+        </w:tc>
+      </w:tr>
+      <w:tr>
+        <w:tc>
+          <w:tcPr>
+            <w:tcW w:type="dxa" w:w="2381"/>
+            <w:tcBorders>
+              <w:top w:val="single" w:sz="4" w:space="0" w:color="CCCCCC"/>
+              <w:left w:val="single" w:sz="4" w:space="0" w:color="CCCCCC"/>
+              <w:bottom w:val="single" w:sz="4" w:space="0" w:color="CCCCCC"/>
+              <w:right w:val="single" w:sz="4" w:space="0" w:color="CCCCCC"/>
+            </w:tcBorders>
+            <w:tcMar>
+              <w:top w:w="110" w:type="dxa"/>
+              <w:bottom w:w="110" w:type="dxa"/>
+              <w:left w:w="160" w:type="dxa"/>
+              <w:right w:w="140" w:type="dxa"/>
+            </w:tcMar>
+            <w:shd w:fill="F3F4F6"/>
+          </w:tcPr>
+          <w:p>
+            <w:pPr>
+              <w:spacing w:line="276" w:lineRule="auto" w:before="0" w:after="0"/>
+            </w:pPr>
+            <w:r/>
+            <w:r>
+              <w:rPr>
+                <w:rFonts w:ascii="Times New Roman" w:hAnsi="Times New Roman"/>
+                <w:b/>
+                <w:color w:val="1E293B"/>
+                <w:sz w:val="21"/>
+              </w:rPr>
+              <w:t>Tautan Media (MPI)</w:t>
+            </w:r>
+          </w:p>
+        </w:tc>
+        <w:tc>
+          <w:tcPr>
+            <w:tcW w:type="dxa" w:w="5556"/>
+            <w:tcBorders>
+              <w:top w:val="single" w:sz="4" w:space="0" w:color="CCCCCC"/>
+              <w:left w:val="single" w:sz="4" w:space="0" w:color="CCCCCC"/>
+              <w:bottom w:val="single" w:sz="4" w:space="0" w:color="CCCCCC"/>
+              <w:right w:val="single" w:sz="4" w:space="0" w:color="CCCCCC"/>
+            </w:tcBorders>
+            <w:tcMar>
+              <w:top w:w="110" w:type="dxa"/>
+              <w:bottom w:w="110" w:type="dxa"/>
+              <w:left w:w="160" w:type="dxa"/>
+              <w:right w:w="140" w:type="dxa"/>
+            </w:tcMar>
+            <w:shd w:fill="FAFAFA"/>
+          </w:tcPr>
+          <w:p>
+            <w:pPr>
+              <w:spacing w:line="276" w:lineRule="auto" w:before="0" w:after="0"/>
+            </w:pPr>
+            <w:r/>
+            <w:r>
+              <w:rPr>
+                <w:rFonts w:ascii="Times New Roman" w:hAnsi="Times New Roman"/>
+                <w:color w:val="0E7490"/>
+                <w:sz w:val="21"/>
+                <w:u w:val="none"/>
+              </w:rPr>
+              <w:t>https://fanani.my.id/lab/mpi/sistem-komputer/</w:t>
+            </w:r>
+          </w:p>
+        </w:tc>
+      </w:tr>
+      <w:tr>
+        <w:tc>
+          <w:tcPr>
+            <w:tcW w:type="dxa" w:w="2381"/>
+            <w:tcBorders>
+              <w:top w:val="single" w:sz="4" w:space="0" w:color="CCCCCC"/>
+              <w:left w:val="single" w:sz="4" w:space="0" w:color="CCCCCC"/>
+              <w:bottom w:val="single" w:sz="4" w:space="0" w:color="CCCCCC"/>
+              <w:right w:val="single" w:sz="4" w:space="0" w:color="CCCCCC"/>
+            </w:tcBorders>
+            <w:tcMar>
+              <w:top w:w="110" w:type="dxa"/>
+              <w:bottom w:w="110" w:type="dxa"/>
+              <w:left w:w="160" w:type="dxa"/>
+              <w:right w:w="140" w:type="dxa"/>
+            </w:tcMar>
+            <w:shd w:fill="F3F4F6"/>
+          </w:tcPr>
+          <w:p>
+            <w:pPr>
+              <w:spacing w:line="276" w:lineRule="auto" w:before="0" w:after="0"/>
+            </w:pPr>
+            <w:r/>
+            <w:r>
+              <w:rPr>
+                <w:rFonts w:ascii="Times New Roman" w:hAnsi="Times New Roman"/>
+                <w:b/>
+                <w:color w:val="1E293B"/>
+                <w:sz w:val="21"/>
+              </w:rPr>
+              <w:t>Portofolio Laboratorium</w:t>
+            </w:r>
+          </w:p>
+        </w:tc>
+        <w:tc>
+          <w:tcPr>
+            <w:tcW w:type="dxa" w:w="5556"/>
+            <w:tcBorders>
+              <w:top w:val="single" w:sz="4" w:space="0" w:color="CCCCCC"/>
+              <w:left w:val="single" w:sz="4" w:space="0" w:color="CCCCCC"/>
+              <w:bottom w:val="single" w:sz="4" w:space="0" w:color="CCCCCC"/>
+              <w:right w:val="single" w:sz="4" w:space="0" w:color="CCCCCC"/>
+            </w:tcBorders>
+            <w:tcMar>
+              <w:top w:w="110" w:type="dxa"/>
+              <w:bottom w:w="110" w:type="dxa"/>
+              <w:left w:w="160" w:type="dxa"/>
+              <w:right w:w="140" w:type="dxa"/>
+            </w:tcMar>
+            <w:shd w:fill="FFFFFF"/>
+          </w:tcPr>
+          <w:p>
+            <w:pPr>
+              <w:spacing w:line="276" w:lineRule="auto" w:before="0" w:after="0"/>
+            </w:pPr>
+            <w:r/>
+            <w:r>
+              <w:rPr>
+                <w:rFonts w:ascii="Times New Roman" w:hAnsi="Times New Roman"/>
+                <w:color w:val="0E7490"/>
+                <w:sz w:val="21"/>
+                <w:u w:val="none"/>
+              </w:rPr>
+              <w:t>https://fanani.my.id/lab/</w:t>
+            </w:r>
+          </w:p>
+        </w:tc>
+      </w:tr>
+      <w:tr>
+        <w:tc>
+          <w:tcPr>
+            <w:tcW w:type="dxa" w:w="2381"/>
+            <w:tcBorders>
+              <w:top w:val="single" w:sz="4" w:space="0" w:color="CCCCCC"/>
+              <w:left w:val="single" w:sz="4" w:space="0" w:color="CCCCCC"/>
+              <w:bottom w:val="single" w:sz="4" w:space="0" w:color="CCCCCC"/>
+              <w:right w:val="single" w:sz="4" w:space="0" w:color="CCCCCC"/>
+            </w:tcBorders>
+            <w:tcMar>
+              <w:top w:w="110" w:type="dxa"/>
+              <w:bottom w:w="110" w:type="dxa"/>
+              <w:left w:w="160" w:type="dxa"/>
+              <w:right w:w="140" w:type="dxa"/>
+            </w:tcMar>
+            <w:shd w:fill="F3F4F6"/>
+          </w:tcPr>
+          <w:p>
+            <w:pPr>
+              <w:spacing w:line="276" w:lineRule="auto" w:before="0" w:after="0"/>
+            </w:pPr>
+            <w:r/>
+            <w:r>
+              <w:rPr>
+                <w:rFonts w:ascii="Times New Roman" w:hAnsi="Times New Roman"/>
+                <w:b/>
+                <w:color w:val="1E293B"/>
+                <w:sz w:val="21"/>
+              </w:rPr>
+              <w:t>Repositori Kode Sumber</w:t>
+            </w:r>
+          </w:p>
+        </w:tc>
+        <w:tc>
+          <w:tcPr>
+            <w:tcW w:type="dxa" w:w="5556"/>
+            <w:tcBorders>
+              <w:top w:val="single" w:sz="4" w:space="0" w:color="CCCCCC"/>
+              <w:left w:val="single" w:sz="4" w:space="0" w:color="CCCCCC"/>
+              <w:bottom w:val="single" w:sz="4" w:space="0" w:color="CCCCCC"/>
+              <w:right w:val="single" w:sz="4" w:space="0" w:color="CCCCCC"/>
+            </w:tcBorders>
+            <w:tcMar>
+              <w:top w:w="110" w:type="dxa"/>
+              <w:bottom w:w="110" w:type="dxa"/>
+              <w:left w:w="160" w:type="dxa"/>
+              <w:right w:w="140" w:type="dxa"/>
+            </w:tcMar>
+            <w:shd w:fill="FAFAFA"/>
+          </w:tcPr>
+          <w:p>
+            <w:pPr>
+              <w:spacing w:line="276" w:lineRule="auto" w:before="0" w:after="0"/>
+            </w:pPr>
+            <w:r/>
+            <w:r>
+              <w:rPr>
+                <w:rFonts w:ascii="Times New Roman" w:hAnsi="Times New Roman"/>
+                <w:color w:val="0E7490"/>
+                <w:sz w:val="21"/>
+                <w:u w:val="none"/>
+              </w:rPr>
+              <w:t>https://github.com/chanif/chanif.github.io</w:t>
+            </w:r>
+          </w:p>
+        </w:tc>
+      </w:tr>
+      <w:tr>
+        <w:tc>
+          <w:tcPr>
+            <w:tcW w:type="dxa" w:w="2381"/>
+            <w:tcBorders>
+              <w:top w:val="single" w:sz="4" w:space="0" w:color="CCCCCC"/>
+              <w:left w:val="single" w:sz="4" w:space="0" w:color="CCCCCC"/>
+              <w:bottom w:val="single" w:sz="4" w:space="0" w:color="CCCCCC"/>
+              <w:right w:val="single" w:sz="4" w:space="0" w:color="CCCCCC"/>
+            </w:tcBorders>
+            <w:tcMar>
+              <w:top w:w="110" w:type="dxa"/>
+              <w:bottom w:w="110" w:type="dxa"/>
+              <w:left w:w="160" w:type="dxa"/>
+              <w:right w:w="140" w:type="dxa"/>
+            </w:tcMar>
+            <w:shd w:fill="F3F4F6"/>
+          </w:tcPr>
+          <w:p>
+            <w:pPr>
+              <w:spacing w:line="276" w:lineRule="auto" w:before="0" w:after="0"/>
+            </w:pPr>
+            <w:r/>
+            <w:r>
+              <w:rPr>
+                <w:rFonts w:ascii="Times New Roman" w:hAnsi="Times New Roman"/>
+                <w:b/>
+                <w:color w:val="1E293B"/>
+                <w:sz w:val="21"/>
               </w:rPr>
               <w:t>Surel (Email)</w:t>
             </w:r>
@@ -260,23 +1067,33 @@
         </w:tc>
         <w:tc>
           <w:tcPr>
-            <w:tcW w:w="5538" w:type="dxa"/>
-            <w:tcBorders>
-              <w:top w:val="single" w:sz="4" w:space="0" w:color="808080"/>
-              <w:left w:val="single" w:sz="4" w:space="0" w:color="808080"/>
-              <w:bottom w:val="single" w:sz="4" w:space="0" w:color="808080"/>
-              <w:right w:val="single" w:sz="4" w:space="0" w:color="808080"/>
-            </w:tcBorders>
-            <w:tcMar>
-              <w:top w:w="50" w:type="dxa"/>
-              <w:left w:w="100" w:type="dxa"/>
-              <w:bottom w:w="50" w:type="dxa"/>
-              <w:right w:w="100" w:type="dxa"/>
-            </w:tcMar>
+            <w:tcW w:type="dxa" w:w="5556"/>
+            <w:tcBorders>
+              <w:top w:val="single" w:sz="4" w:space="0" w:color="CCCCCC"/>
+              <w:left w:val="single" w:sz="4" w:space="0" w:color="CCCCCC"/>
+              <w:bottom w:val="single" w:sz="4" w:space="0" w:color="CCCCCC"/>
+              <w:right w:val="single" w:sz="4" w:space="0" w:color="CCCCCC"/>
+            </w:tcBorders>
+            <w:tcMar>
+              <w:top w:w="110" w:type="dxa"/>
+              <w:bottom w:w="110" w:type="dxa"/>
+              <w:left w:w="160" w:type="dxa"/>
+              <w:right w:w="140" w:type="dxa"/>
+            </w:tcMar>
+            <w:shd w:fill="FFFFFF"/>
           </w:tcPr>
           <w:p>
+            <w:pPr>
+              <w:spacing w:line="276" w:lineRule="auto" w:before="0" w:after="0"/>
+            </w:pPr>
+            <w:r/>
             <w:r>
-              <w:t>chanifuddin@gmail.com</w:t>
+              <w:rPr>
+                <w:rFonts w:ascii="Times New Roman" w:hAnsi="Times New Roman"/>
+                <w:color w:val="0F172A"/>
+                <w:sz w:val="21"/>
+              </w:rPr>
+              <w:t>chanifuddin@gmail.com / pak@fanani.my.id</w:t>
             </w:r>
           </w:p>
         </w:tc>
@@ -284,117 +1101,67 @@
       <w:tr>
         <w:tc>
           <w:tcPr>
-            <w:tcW w:w="2400" w:type="dxa"/>
-            <w:tcBorders>
-              <w:top w:val="single" w:sz="4" w:space="0" w:color="808080"/>
-              <w:left w:val="single" w:sz="4" w:space="0" w:color="808080"/>
-              <w:bottom w:val="single" w:sz="4" w:space="0" w:color="808080"/>
-              <w:right w:val="single" w:sz="4" w:space="0" w:color="808080"/>
-            </w:tcBorders>
-            <w:shd w:val="clear" w:color="auto" w:fill="F2F2F2"/>
-            <w:tcMar>
-              <w:top w:w="50" w:type="dxa"/>
-              <w:left w:w="100" w:type="dxa"/>
-              <w:bottom w:w="50" w:type="dxa"/>
-              <w:right w:w="100" w:type="dxa"/>
-            </w:tcMar>
+            <w:tcW w:type="dxa" w:w="2381"/>
+            <w:tcBorders>
+              <w:top w:val="single" w:sz="4" w:space="0" w:color="CCCCCC"/>
+              <w:left w:val="single" w:sz="4" w:space="0" w:color="CCCCCC"/>
+              <w:bottom w:val="single" w:sz="4" w:space="0" w:color="CCCCCC"/>
+              <w:right w:val="single" w:sz="4" w:space="0" w:color="CCCCCC"/>
+            </w:tcBorders>
+            <w:tcMar>
+              <w:top w:w="110" w:type="dxa"/>
+              <w:bottom w:w="110" w:type="dxa"/>
+              <w:left w:w="160" w:type="dxa"/>
+              <w:right w:w="140" w:type="dxa"/>
+            </w:tcMar>
+            <w:shd w:fill="F3F4F6"/>
           </w:tcPr>
           <w:p>
+            <w:pPr>
+              <w:spacing w:line="276" w:lineRule="auto" w:before="0" w:after="0"/>
+            </w:pPr>
+            <w:r/>
             <w:r>
               <w:rPr>
+                <w:rFonts w:ascii="Times New Roman" w:hAnsi="Times New Roman"/>
                 <w:b/>
-                <w:bCs/>
+                <w:color w:val="1E293B"/>
+                <w:sz w:val="21"/>
               </w:rPr>
-              <w:t>Portofolio</w:t>
+              <w:t>Nomor Telepon / WhatsApp</w:t>
             </w:r>
           </w:p>
         </w:tc>
         <w:tc>
           <w:tcPr>
-            <w:tcW w:w="5538" w:type="dxa"/>
-            <w:tcBorders>
-              <w:top w:val="single" w:sz="4" w:space="0" w:color="808080"/>
-              <w:left w:val="single" w:sz="4" w:space="0" w:color="808080"/>
-              <w:bottom w:val="single" w:sz="4" w:space="0" w:color="808080"/>
-              <w:right w:val="single" w:sz="4" w:space="0" w:color="808080"/>
-            </w:tcBorders>
-            <w:tcMar>
-              <w:top w:w="50" w:type="dxa"/>
-              <w:left w:w="100" w:type="dxa"/>
-              <w:bottom w:w="50" w:type="dxa"/>
-              <w:right w:w="100" w:type="dxa"/>
-            </w:tcMar>
+            <w:tcW w:type="dxa" w:w="5556"/>
+            <w:tcBorders>
+              <w:top w:val="single" w:sz="4" w:space="0" w:color="CCCCCC"/>
+              <w:left w:val="single" w:sz="4" w:space="0" w:color="CCCCCC"/>
+              <w:bottom w:val="single" w:sz="4" w:space="0" w:color="CCCCCC"/>
+              <w:right w:val="single" w:sz="4" w:space="0" w:color="CCCCCC"/>
+            </w:tcBorders>
+            <w:tcMar>
+              <w:top w:w="110" w:type="dxa"/>
+              <w:bottom w:w="110" w:type="dxa"/>
+              <w:left w:w="160" w:type="dxa"/>
+              <w:right w:w="140" w:type="dxa"/>
+            </w:tcMar>
+            <w:shd w:fill="FAFAFA"/>
           </w:tcPr>
           <w:p>
-            <w:hyperlink r:id="rId7" w:history="1">
-              <w:r>
-                <w:rPr>
-                  <w:color w:val="0563C1"/>
-                  <w:u w:val="single"/>
-                </w:rPr>
-                <w:t>https://fanani.my.id</w:t>
-              </w:r>
-            </w:hyperlink>
-            <w:r>
-              <w:t xml:space="preserve"> (menu “Lab”)</w:t>
-            </w:r>
-          </w:p>
-        </w:tc>
-      </w:tr>
-      <w:tr>
-        <w:tc>
-          <w:tcPr>
-            <w:tcW w:w="2400" w:type="dxa"/>
-            <w:tcBorders>
-              <w:top w:val="single" w:sz="4" w:space="0" w:color="808080"/>
-              <w:left w:val="single" w:sz="4" w:space="0" w:color="808080"/>
-              <w:bottom w:val="single" w:sz="4" w:space="0" w:color="808080"/>
-              <w:right w:val="single" w:sz="4" w:space="0" w:color="808080"/>
-            </w:tcBorders>
-            <w:shd w:val="clear" w:color="auto" w:fill="F2F2F2"/>
-            <w:tcMar>
-              <w:top w:w="50" w:type="dxa"/>
-              <w:left w:w="100" w:type="dxa"/>
-              <w:bottom w:w="50" w:type="dxa"/>
-              <w:right w:w="100" w:type="dxa"/>
-            </w:tcMar>
-          </w:tcPr>
-          <w:p>
+            <w:pPr>
+              <w:spacing w:line="276" w:lineRule="auto" w:before="0" w:after="0"/>
+            </w:pPr>
+            <w:r/>
             <w:r>
               <w:rPr>
-                <w:b/>
-                <w:bCs/>
+                <w:rFonts w:ascii="Times New Roman" w:hAnsi="Times New Roman"/>
+                <w:color w:val="0F172A"/>
+                <w:sz w:val="21"/>
               </w:rPr>
-              <w:t>Tautan Media</w:t>
+              <w:t>+62 815-8885-508</w:t>
             </w:r>
-          </w:p>
-        </w:tc>
-        <w:tc>
-          <w:tcPr>
-            <w:tcW w:w="5538" w:type="dxa"/>
-            <w:tcBorders>
-              <w:top w:val="single" w:sz="4" w:space="0" w:color="808080"/>
-              <w:left w:val="single" w:sz="4" w:space="0" w:color="808080"/>
-              <w:bottom w:val="single" w:sz="4" w:space="0" w:color="808080"/>
-              <w:right w:val="single" w:sz="4" w:space="0" w:color="808080"/>
-            </w:tcBorders>
-            <w:tcMar>
-              <w:top w:w="50" w:type="dxa"/>
-              <w:left w:w="100" w:type="dxa"/>
-              <w:bottom w:w="50" w:type="dxa"/>
-              <w:right w:w="100" w:type="dxa"/>
-            </w:tcMar>
-          </w:tcPr>
-          <w:p>
-            <w:hyperlink r:id="rId8" w:history="1">
-              <w:r>
-                <w:rPr>
-                  <w:color w:val="0563C1"/>
-                  <w:u w:val="single"/>
-                </w:rPr>
-                <w:t>https://fanani.my.id/lab/mpi/sistem-komputer/</w:t>
-              </w:r>
-            </w:hyperlink>
           </w:p>
         </w:tc>
       </w:tr>

</xml_diff>

<commit_message>
docs: perbarui naskah Apresiasi GTK 2026 dan tambahkan aset bahan visual video
</commit_message>
<xml_diff>
--- a/lab/doc/20260930 - Apresiasi GTK 2026/Naskah Apresiasi GTK 2026 - Inovasi Pembelajaran -  Fanani - Lamongan.docx
+++ b/lab/doc/20260930 - Apresiasi GTK 2026/Naskah Apresiasi GTK 2026 - Inovasi Pembelajaran -  Fanani - Lamongan.docx
@@ -1,6 +1,6 @@
 
 <file path=word/document.xml><?xml version="1.0" encoding="utf-8"?>
-<w:document xmlns:wpc="http://schemas.microsoft.com/office/word/2010/wordprocessingCanvas" xmlns:cx="http://schemas.microsoft.com/office/drawing/2014/chartex" xmlns:cx1="http://schemas.microsoft.com/office/drawing/2015/9/8/chartex" xmlns:cx2="http://schemas.microsoft.com/office/drawing/2015/10/21/chartex" xmlns:cx3="http://schemas.microsoft.com/office/drawing/2016/5/9/chartex" xmlns:cx4="http://schemas.microsoft.com/office/drawing/2016/5/10/chartex" xmlns:cx5="http://schemas.microsoft.com/office/drawing/2016/5/11/chartex" xmlns:cx6="http://schemas.microsoft.com/office/drawing/2016/5/12/chartex" xmlns:cx7="http://schemas.microsoft.com/office/drawing/2016/5/13/chartex" xmlns:cx8="http://schemas.microsoft.com/office/drawing/2016/5/14/chartex" xmlns:mc="http://schemas.openxmlformats.org/markup-compatibility/2006" xmlns:aink="http://schemas.microsoft.com/office/drawing/2016/ink" xmlns:am3d="http://schemas.microsoft.com/office/drawing/2017/model3d" xmlns:o="urn:schemas-microsoft-com:office:office" xmlns:oel="http://schemas.microsoft.com/office/2019/extlst" xmlns:r="http://schemas.openxmlformats.org/officeDocument/2006/relationships" xmlns:m="http://schemas.openxmlformats.org/officeDocument/2006/math" xmlns:v="urn:schemas-microsoft-com:vml" xmlns:wp14="http://schemas.microsoft.com/office/word/2010/wordprocessingDrawing" xmlns:wp="http://schemas.openxmlformats.org/drawingml/2006/wordprocessingDrawing" xmlns:w10="urn:schemas-microsoft-com:office:word" xmlns:w="http://schemas.openxmlformats.org/wordprocessingml/2006/main" xmlns:w14="http://schemas.microsoft.com/office/word/2010/wordml" xmlns:w15="http://schemas.microsoft.com/office/word/2012/wordml" xmlns:w16cex="http://schemas.microsoft.com/office/word/2018/wordml/cex" xmlns:w16cid="http://schemas.microsoft.com/office/word/2016/wordml/cid" xmlns:w16="http://schemas.microsoft.com/office/word/2018/wordml" xmlns:w16du="http://schemas.microsoft.com/office/word/2023/wordml/word16du" xmlns:w16sdtdh="http://schemas.microsoft.com/office/word/2020/wordml/sdtdatahash" xmlns:w16sdtfl="http://schemas.microsoft.com/office/word/2024/wordml/sdtformatlock" xmlns:w16se="http://schemas.microsoft.com/office/word/2015/wordml/symex" xmlns:wpg="http://schemas.microsoft.com/office/word/2010/wordprocessingGroup" xmlns:wpi="http://schemas.microsoft.com/office/word/2010/wordprocessingInk" xmlns:wne="http://schemas.microsoft.com/office/word/2006/wordml" xmlns:wps="http://schemas.microsoft.com/office/word/2010/wordprocessingShape" mc:Ignorable="w14 w15 w16se w16cid w16 w16cex w16sdtdh w16sdtfl w16du wp14">
+<w:document xmlns:wpc="http://schemas.microsoft.com/office/word/2010/wordprocessingCanvas" xmlns:cx="http://schemas.microsoft.com/office/drawing/2014/chartex" xmlns:cx1="http://schemas.microsoft.com/office/drawing/2015/9/8/chartex" xmlns:cx2="http://schemas.microsoft.com/office/drawing/2015/10/21/chartex" xmlns:cx3="http://schemas.microsoft.com/office/drawing/2016/5/9/chartex" xmlns:cx4="http://schemas.microsoft.com/office/drawing/2016/5/10/chartex" xmlns:cx5="http://schemas.microsoft.com/office/drawing/2016/5/11/chartex" xmlns:cx6="http://schemas.microsoft.com/office/drawing/2016/5/12/chartex" xmlns:cx7="http://schemas.microsoft.com/office/drawing/2016/5/13/chartex" xmlns:cx8="http://schemas.microsoft.com/office/drawing/2016/5/14/chartex" xmlns:mc="http://schemas.openxmlformats.org/markup-compatibility/2006" xmlns:aink="http://schemas.microsoft.com/office/drawing/2016/ink" xmlns:am3d="http://schemas.microsoft.com/office/drawing/2017/model3d" xmlns:o="urn:schemas-microsoft-com:office:office" xmlns:r="http://schemas.openxmlformats.org/officeDocument/2006/relationships" xmlns:m="http://schemas.openxmlformats.org/officeDocument/2006/math" xmlns:v="urn:schemas-microsoft-com:vml" xmlns:wp14="http://schemas.microsoft.com/office/word/2010/wordprocessingDrawing" xmlns:wp="http://schemas.openxmlformats.org/drawingml/2006/wordprocessingDrawing" xmlns:w10="urn:schemas-microsoft-com:office:word" xmlns:w="http://schemas.openxmlformats.org/wordprocessingml/2006/main" xmlns:w14="http://schemas.microsoft.com/office/word/2010/wordml" xmlns:w15="http://schemas.microsoft.com/office/word/2012/wordml" xmlns:w16cex="http://schemas.microsoft.com/office/word/2018/wordml/cex" xmlns:w16cid="http://schemas.microsoft.com/office/word/2016/wordml/cid" xmlns:w16="http://schemas.microsoft.com/office/word/2018/wordml" xmlns:w16se="http://schemas.microsoft.com/office/word/2015/wordml/symex" xmlns:wpg="http://schemas.microsoft.com/office/word/2010/wordprocessingGroup" xmlns:wpi="http://schemas.microsoft.com/office/word/2010/wordprocessingInk" xmlns:wne="http://schemas.microsoft.com/office/word/2006/wordml" xmlns:wps="http://schemas.microsoft.com/office/word/2010/wordprocessingShape" mc:Ignorable="w14 w15 w16se w16cid w16 w16cex wp14">
   <w:body>
     <w:p>
       <w:pPr>
@@ -41,7 +41,7 @@
     </w:p>
     <w:p>
       <w:pPr>
-        <w:spacing w:after="200"/>
+        <w:spacing w:before="360" w:after="480"/>
         <w:jc w:val="center"/>
       </w:pPr>
       <w:r>
@@ -49,73 +49,60 @@
           <w:b/>
           <w:bCs/>
         </w:rPr>
-        <w:t>MENYELAM KE DALAM MESIN DIGITAL: INOVASI MEDIA PEMBELAJARAN INTERAKTIF SISTEM KOMPUTER BERBASIS WEB DI SMP NEGERI 2 LAMONGAN</w:t>
+        <w:t xml:space="preserve">MENYELAM KE DALAM MESIN DIGITAL: INOVASI MEDIA PEMBELAJARAN INTERAKTIF SISTEM KOMPUTER BERBASIS WEB DI </w:t>
+      </w:r>
+      <w:r>
+        <w:rPr>
+          <w:b/>
+          <w:bCs/>
+        </w:rPr>
+        <w:t>SMP NEGERI 2 LAMONGAN</w:t>
       </w:r>
     </w:p>
     <w:tbl>
       <w:tblPr>
         <w:tblW w:w="7938" w:type="dxa"/>
         <w:jc w:val="center"/>
+        <w:tblBorders>
+          <w:top w:val="single" w:sz="6" w:space="0" w:color="94A3B8"/>
+          <w:bottom w:val="single" w:sz="6" w:space="0" w:color="94A3B8"/>
+          <w:insideH w:val="single" w:sz="4" w:space="0" w:color="E2E8F0"/>
+        </w:tblBorders>
         <w:tblCellMar>
           <w:left w:w="10" w:type="dxa"/>
           <w:right w:w="10" w:type="dxa"/>
         </w:tblCellMar>
         <w:tblLook w:val="04A0" w:firstRow="1" w:lastRow="0" w:firstColumn="1" w:lastColumn="0" w:noHBand="0" w:noVBand="1"/>
-        <w:tblBorders>
-          <w:top w:val="single" w:sz="6" w:space="0" w:color="94A3B8"/>
-          <w:left w:val="none"/>
-          <w:bottom w:val="single" w:sz="6" w:space="0" w:color="94A3B8"/>
-          <w:right w:val="none"/>
-          <w:insideH w:val="single" w:sz="4" w:space="0" w:color="E2E8F0"/>
-          <w:insideV w:val="none"/>
-        </w:tblBorders>
       </w:tblPr>
       <w:tblGrid>
-        <w:gridCol w:w="2400"/>
-        <w:gridCol w:w="5538"/>
+        <w:gridCol w:w="2972"/>
+        <w:gridCol w:w="4966"/>
       </w:tblGrid>
       <w:tr>
+        <w:trPr>
+          <w:jc w:val="center"/>
+        </w:trPr>
         <w:tc>
           <w:tcPr>
-            <w:tcW w:w="2381" w:type="dxa"/>
-            <w:tcBorders>
-              <w:top w:val="single" w:sz="4" w:space="0" w:color="808080"/>
-              <w:left w:val="single" w:sz="4" w:space="0" w:color="808080"/>
-              <w:bottom w:val="single" w:sz="4" w:space="0" w:color="808080"/>
-              <w:right w:val="single" w:sz="4" w:space="0" w:color="808080"/>
-            </w:tcBorders>
-            <w:shd w:val="clear" w:color="auto" w:fill="F2F2F2"/>
-            <w:tcMar>
-              <w:top w:w="50" w:type="dxa"/>
-              <w:left w:w="100" w:type="dxa"/>
-              <w:bottom w:w="50" w:type="dxa"/>
-              <w:right w:w="100" w:type="dxa"/>
-            </w:tcMar>
+            <w:tcW w:w="2972" w:type="dxa"/>
             <w:tcBorders>
               <w:top w:val="single" w:sz="4" w:space="0" w:color="CCCCCC"/>
               <w:left w:val="single" w:sz="4" w:space="0" w:color="CCCCCC"/>
               <w:bottom w:val="single" w:sz="4" w:space="0" w:color="CCCCCC"/>
               <w:right w:val="single" w:sz="4" w:space="0" w:color="CCCCCC"/>
             </w:tcBorders>
+            <w:shd w:val="clear" w:color="auto" w:fill="F3F4F6"/>
             <w:tcMar>
               <w:top w:w="110" w:type="dxa"/>
+              <w:left w:w="160" w:type="dxa"/>
               <w:bottom w:w="110" w:type="dxa"/>
-              <w:left w:w="160" w:type="dxa"/>
               <w:right w:w="140" w:type="dxa"/>
             </w:tcMar>
-            <w:shd w:fill="F3F4F6"/>
           </w:tcPr>
           <w:p>
-            <w:pPr>
-              <w:spacing w:line="276" w:lineRule="auto" w:before="0" w:after="0"/>
-            </w:pPr>
-            <w:r/>
             <w:r>
               <w:rPr>
-                <w:rFonts w:ascii="Times New Roman" w:hAnsi="Times New Roman"/>
                 <w:b/>
-                <w:color w:val="1E293B"/>
-                <w:sz w:val="21"/>
               </w:rPr>
               <w:t>Nama Lengkap</w:t>
             </w:r>
@@ -123,91 +110,53 @@
         </w:tc>
         <w:tc>
           <w:tcPr>
-            <w:tcW w:w="5556" w:type="dxa"/>
-            <w:tcBorders>
-              <w:top w:val="single" w:sz="4" w:space="0" w:color="808080"/>
-              <w:left w:val="single" w:sz="4" w:space="0" w:color="808080"/>
-              <w:bottom w:val="single" w:sz="4" w:space="0" w:color="808080"/>
-              <w:right w:val="single" w:sz="4" w:space="0" w:color="808080"/>
-            </w:tcBorders>
-            <w:tcMar>
-              <w:top w:w="50" w:type="dxa"/>
-              <w:left w:w="100" w:type="dxa"/>
-              <w:bottom w:w="50" w:type="dxa"/>
-              <w:right w:w="100" w:type="dxa"/>
-            </w:tcMar>
+            <w:tcW w:w="4966" w:type="dxa"/>
             <w:tcBorders>
               <w:top w:val="single" w:sz="4" w:space="0" w:color="CCCCCC"/>
               <w:left w:val="single" w:sz="4" w:space="0" w:color="CCCCCC"/>
               <w:bottom w:val="single" w:sz="4" w:space="0" w:color="CCCCCC"/>
               <w:right w:val="single" w:sz="4" w:space="0" w:color="CCCCCC"/>
             </w:tcBorders>
+            <w:shd w:val="clear" w:color="auto" w:fill="FFFFFF"/>
             <w:tcMar>
               <w:top w:w="110" w:type="dxa"/>
+              <w:left w:w="160" w:type="dxa"/>
               <w:bottom w:w="110" w:type="dxa"/>
-              <w:left w:w="160" w:type="dxa"/>
               <w:right w:w="140" w:type="dxa"/>
             </w:tcMar>
-            <w:shd w:fill="FFFFFF"/>
           </w:tcPr>
           <w:p>
-            <w:pPr>
-              <w:spacing w:line="276" w:lineRule="auto" w:before="0" w:after="0"/>
-            </w:pPr>
-            <w:r/>
             <w:r>
-              <w:rPr>
-                <w:rFonts w:ascii="Times New Roman" w:hAnsi="Times New Roman"/>
-                <w:color w:val="0F172A"/>
-                <w:sz w:val="21"/>
-              </w:rPr>
               <w:t>Ach. Chanifuddin Fanani, S.Pd.</w:t>
             </w:r>
           </w:p>
         </w:tc>
       </w:tr>
       <w:tr>
+        <w:trPr>
+          <w:jc w:val="center"/>
+        </w:trPr>
         <w:tc>
           <w:tcPr>
-            <w:tcW w:w="2381" w:type="dxa"/>
-            <w:tcBorders>
-              <w:top w:val="single" w:sz="4" w:space="0" w:color="808080"/>
-              <w:left w:val="single" w:sz="4" w:space="0" w:color="808080"/>
-              <w:bottom w:val="single" w:sz="4" w:space="0" w:color="808080"/>
-              <w:right w:val="single" w:sz="4" w:space="0" w:color="808080"/>
-            </w:tcBorders>
-            <w:shd w:val="clear" w:color="auto" w:fill="F2F2F2"/>
-            <w:tcMar>
-              <w:top w:w="50" w:type="dxa"/>
-              <w:left w:w="100" w:type="dxa"/>
-              <w:bottom w:w="50" w:type="dxa"/>
-              <w:right w:w="100" w:type="dxa"/>
-            </w:tcMar>
+            <w:tcW w:w="2972" w:type="dxa"/>
             <w:tcBorders>
               <w:top w:val="single" w:sz="4" w:space="0" w:color="CCCCCC"/>
               <w:left w:val="single" w:sz="4" w:space="0" w:color="CCCCCC"/>
               <w:bottom w:val="single" w:sz="4" w:space="0" w:color="CCCCCC"/>
               <w:right w:val="single" w:sz="4" w:space="0" w:color="CCCCCC"/>
             </w:tcBorders>
+            <w:shd w:val="clear" w:color="auto" w:fill="F3F4F6"/>
             <w:tcMar>
               <w:top w:w="110" w:type="dxa"/>
+              <w:left w:w="160" w:type="dxa"/>
               <w:bottom w:w="110" w:type="dxa"/>
-              <w:left w:w="160" w:type="dxa"/>
               <w:right w:w="140" w:type="dxa"/>
             </w:tcMar>
-            <w:shd w:fill="F3F4F6"/>
           </w:tcPr>
           <w:p>
-            <w:pPr>
-              <w:spacing w:line="276" w:lineRule="auto" w:before="0" w:after="0"/>
-            </w:pPr>
-            <w:r/>
             <w:r>
               <w:rPr>
-                <w:rFonts w:ascii="Times New Roman" w:hAnsi="Times New Roman"/>
                 <w:b/>
-                <w:color w:val="1E293B"/>
-                <w:sz w:val="21"/>
               </w:rPr>
               <w:t>NIP</w:t>
             </w:r>
@@ -215,91 +164,53 @@
         </w:tc>
         <w:tc>
           <w:tcPr>
-            <w:tcW w:w="5556" w:type="dxa"/>
-            <w:tcBorders>
-              <w:top w:val="single" w:sz="4" w:space="0" w:color="808080"/>
-              <w:left w:val="single" w:sz="4" w:space="0" w:color="808080"/>
-              <w:bottom w:val="single" w:sz="4" w:space="0" w:color="808080"/>
-              <w:right w:val="single" w:sz="4" w:space="0" w:color="808080"/>
-            </w:tcBorders>
-            <w:tcMar>
-              <w:top w:w="50" w:type="dxa"/>
-              <w:left w:w="100" w:type="dxa"/>
-              <w:bottom w:w="50" w:type="dxa"/>
-              <w:right w:w="100" w:type="dxa"/>
-            </w:tcMar>
+            <w:tcW w:w="4966" w:type="dxa"/>
             <w:tcBorders>
               <w:top w:val="single" w:sz="4" w:space="0" w:color="CCCCCC"/>
               <w:left w:val="single" w:sz="4" w:space="0" w:color="CCCCCC"/>
               <w:bottom w:val="single" w:sz="4" w:space="0" w:color="CCCCCC"/>
               <w:right w:val="single" w:sz="4" w:space="0" w:color="CCCCCC"/>
             </w:tcBorders>
+            <w:shd w:val="clear" w:color="auto" w:fill="FAFAFA"/>
             <w:tcMar>
               <w:top w:w="110" w:type="dxa"/>
+              <w:left w:w="160" w:type="dxa"/>
               <w:bottom w:w="110" w:type="dxa"/>
-              <w:left w:w="160" w:type="dxa"/>
               <w:right w:w="140" w:type="dxa"/>
             </w:tcMar>
-            <w:shd w:fill="FAFAFA"/>
           </w:tcPr>
           <w:p>
-            <w:pPr>
-              <w:spacing w:line="276" w:lineRule="auto" w:before="0" w:after="0"/>
-            </w:pPr>
-            <w:r/>
             <w:r>
-              <w:rPr>
-                <w:rFonts w:ascii="Times New Roman" w:hAnsi="Times New Roman"/>
-                <w:color w:val="0F172A"/>
-                <w:sz w:val="21"/>
-              </w:rPr>
               <w:t>19910826 202012 1 007</w:t>
             </w:r>
           </w:p>
         </w:tc>
       </w:tr>
       <w:tr>
+        <w:trPr>
+          <w:jc w:val="center"/>
+        </w:trPr>
         <w:tc>
           <w:tcPr>
-            <w:tcW w:w="2381" w:type="dxa"/>
-            <w:tcBorders>
-              <w:top w:val="single" w:sz="4" w:space="0" w:color="808080"/>
-              <w:left w:val="single" w:sz="4" w:space="0" w:color="808080"/>
-              <w:bottom w:val="single" w:sz="4" w:space="0" w:color="808080"/>
-              <w:right w:val="single" w:sz="4" w:space="0" w:color="808080"/>
-            </w:tcBorders>
-            <w:shd w:val="clear" w:color="auto" w:fill="F2F2F2"/>
-            <w:tcMar>
-              <w:top w:w="50" w:type="dxa"/>
-              <w:left w:w="100" w:type="dxa"/>
-              <w:bottom w:w="50" w:type="dxa"/>
-              <w:right w:w="100" w:type="dxa"/>
-            </w:tcMar>
+            <w:tcW w:w="2972" w:type="dxa"/>
             <w:tcBorders>
               <w:top w:val="single" w:sz="4" w:space="0" w:color="CCCCCC"/>
               <w:left w:val="single" w:sz="4" w:space="0" w:color="CCCCCC"/>
               <w:bottom w:val="single" w:sz="4" w:space="0" w:color="CCCCCC"/>
               <w:right w:val="single" w:sz="4" w:space="0" w:color="CCCCCC"/>
             </w:tcBorders>
+            <w:shd w:val="clear" w:color="auto" w:fill="F3F4F6"/>
             <w:tcMar>
               <w:top w:w="110" w:type="dxa"/>
+              <w:left w:w="160" w:type="dxa"/>
               <w:bottom w:w="110" w:type="dxa"/>
-              <w:left w:w="160" w:type="dxa"/>
               <w:right w:w="140" w:type="dxa"/>
             </w:tcMar>
-            <w:shd w:fill="F3F4F6"/>
           </w:tcPr>
           <w:p>
-            <w:pPr>
-              <w:spacing w:line="276" w:lineRule="auto" w:before="0" w:after="0"/>
-            </w:pPr>
-            <w:r/>
             <w:r>
               <w:rPr>
-                <w:rFonts w:ascii="Times New Roman" w:hAnsi="Times New Roman"/>
                 <w:b/>
-                <w:color w:val="1E293B"/>
-                <w:sz w:val="21"/>
               </w:rPr>
               <w:t>NUPTK</w:t>
             </w:r>
@@ -307,183 +218,107 @@
         </w:tc>
         <w:tc>
           <w:tcPr>
-            <w:tcW w:w="5556" w:type="dxa"/>
-            <w:tcBorders>
-              <w:top w:val="single" w:sz="4" w:space="0" w:color="808080"/>
-              <w:left w:val="single" w:sz="4" w:space="0" w:color="808080"/>
-              <w:bottom w:val="single" w:sz="4" w:space="0" w:color="808080"/>
-              <w:right w:val="single" w:sz="4" w:space="0" w:color="808080"/>
-            </w:tcBorders>
-            <w:tcMar>
-              <w:top w:w="50" w:type="dxa"/>
-              <w:left w:w="100" w:type="dxa"/>
-              <w:bottom w:w="50" w:type="dxa"/>
-              <w:right w:w="100" w:type="dxa"/>
-            </w:tcMar>
+            <w:tcW w:w="4966" w:type="dxa"/>
             <w:tcBorders>
               <w:top w:val="single" w:sz="4" w:space="0" w:color="CCCCCC"/>
               <w:left w:val="single" w:sz="4" w:space="0" w:color="CCCCCC"/>
               <w:bottom w:val="single" w:sz="4" w:space="0" w:color="CCCCCC"/>
               <w:right w:val="single" w:sz="4" w:space="0" w:color="CCCCCC"/>
             </w:tcBorders>
+            <w:shd w:val="clear" w:color="auto" w:fill="FFFFFF"/>
             <w:tcMar>
               <w:top w:w="110" w:type="dxa"/>
+              <w:left w:w="160" w:type="dxa"/>
               <w:bottom w:w="110" w:type="dxa"/>
-              <w:left w:w="160" w:type="dxa"/>
               <w:right w:w="140" w:type="dxa"/>
             </w:tcMar>
-            <w:shd w:fill="FFFFFF"/>
           </w:tcPr>
           <w:p>
-            <w:pPr>
-              <w:spacing w:line="276" w:lineRule="auto" w:before="0" w:after="0"/>
-            </w:pPr>
-            <w:r/>
             <w:r>
-              <w:rPr>
-                <w:rFonts w:ascii="Times New Roman" w:hAnsi="Times New Roman"/>
-                <w:color w:val="0F172A"/>
-                <w:sz w:val="21"/>
-              </w:rPr>
-              <w:t>9158 7696 7013 0183</w:t>
+              <w:t>9158769670130183</w:t>
             </w:r>
           </w:p>
         </w:tc>
       </w:tr>
       <w:tr>
+        <w:trPr>
+          <w:jc w:val="center"/>
+        </w:trPr>
         <w:tc>
           <w:tcPr>
-            <w:tcW w:w="2381" w:type="dxa"/>
-            <w:tcBorders>
-              <w:top w:val="single" w:sz="4" w:space="0" w:color="808080"/>
-              <w:left w:val="single" w:sz="4" w:space="0" w:color="808080"/>
-              <w:bottom w:val="single" w:sz="4" w:space="0" w:color="808080"/>
-              <w:right w:val="single" w:sz="4" w:space="0" w:color="808080"/>
-            </w:tcBorders>
-            <w:shd w:val="clear" w:color="auto" w:fill="F2F2F2"/>
-            <w:tcMar>
-              <w:top w:w="50" w:type="dxa"/>
-              <w:left w:w="100" w:type="dxa"/>
-              <w:bottom w:w="50" w:type="dxa"/>
-              <w:right w:w="100" w:type="dxa"/>
-            </w:tcMar>
+            <w:tcW w:w="2972" w:type="dxa"/>
             <w:tcBorders>
               <w:top w:val="single" w:sz="4" w:space="0" w:color="CCCCCC"/>
               <w:left w:val="single" w:sz="4" w:space="0" w:color="CCCCCC"/>
               <w:bottom w:val="single" w:sz="4" w:space="0" w:color="CCCCCC"/>
               <w:right w:val="single" w:sz="4" w:space="0" w:color="CCCCCC"/>
             </w:tcBorders>
+            <w:shd w:val="clear" w:color="auto" w:fill="F3F4F6"/>
             <w:tcMar>
               <w:top w:w="110" w:type="dxa"/>
+              <w:left w:w="160" w:type="dxa"/>
               <w:bottom w:w="110" w:type="dxa"/>
-              <w:left w:w="160" w:type="dxa"/>
               <w:right w:w="140" w:type="dxa"/>
             </w:tcMar>
-            <w:shd w:fill="F3F4F6"/>
           </w:tcPr>
           <w:p>
-            <w:pPr>
-              <w:spacing w:line="276" w:lineRule="auto" w:before="0" w:after="0"/>
-            </w:pPr>
-            <w:r/>
             <w:r>
               <w:rPr>
-                <w:rFonts w:ascii="Times New Roman" w:hAnsi="Times New Roman"/>
                 <w:b/>
-                <w:color w:val="1E293B"/>
-                <w:sz w:val="21"/>
               </w:rPr>
-              <w:t>Jabatan / Kategori</w:t>
+              <w:t>Kategori</w:t>
             </w:r>
           </w:p>
         </w:tc>
         <w:tc>
           <w:tcPr>
-            <w:tcW w:w="5556" w:type="dxa"/>
-            <w:tcBorders>
-              <w:top w:val="single" w:sz="4" w:space="0" w:color="808080"/>
-              <w:left w:val="single" w:sz="4" w:space="0" w:color="808080"/>
-              <w:bottom w:val="single" w:sz="4" w:space="0" w:color="808080"/>
-              <w:right w:val="single" w:sz="4" w:space="0" w:color="808080"/>
-            </w:tcBorders>
-            <w:tcMar>
-              <w:top w:w="50" w:type="dxa"/>
-              <w:left w:w="100" w:type="dxa"/>
-              <w:bottom w:w="50" w:type="dxa"/>
-              <w:right w:w="100" w:type="dxa"/>
-            </w:tcMar>
+            <w:tcW w:w="4966" w:type="dxa"/>
             <w:tcBorders>
               <w:top w:val="single" w:sz="4" w:space="0" w:color="CCCCCC"/>
               <w:left w:val="single" w:sz="4" w:space="0" w:color="CCCCCC"/>
               <w:bottom w:val="single" w:sz="4" w:space="0" w:color="CCCCCC"/>
               <w:right w:val="single" w:sz="4" w:space="0" w:color="CCCCCC"/>
             </w:tcBorders>
+            <w:shd w:val="clear" w:color="auto" w:fill="FAFAFA"/>
             <w:tcMar>
               <w:top w:w="110" w:type="dxa"/>
+              <w:left w:w="160" w:type="dxa"/>
               <w:bottom w:w="110" w:type="dxa"/>
-              <w:left w:w="160" w:type="dxa"/>
               <w:right w:w="140" w:type="dxa"/>
             </w:tcMar>
-            <w:shd w:fill="FAFAFA"/>
           </w:tcPr>
           <w:p>
-            <w:pPr>
-              <w:spacing w:line="276" w:lineRule="auto" w:before="0" w:after="0"/>
-            </w:pPr>
-            <w:r/>
             <w:r>
-              <w:rPr>
-                <w:rFonts w:ascii="Times New Roman" w:hAnsi="Times New Roman"/>
-                <w:color w:val="0F172A"/>
-                <w:sz w:val="21"/>
-              </w:rPr>
               <w:t>Guru SMP Transformatif</w:t>
             </w:r>
           </w:p>
         </w:tc>
       </w:tr>
       <w:tr>
+        <w:trPr>
+          <w:jc w:val="center"/>
+        </w:trPr>
         <w:tc>
           <w:tcPr>
-            <w:tcW w:w="2381" w:type="dxa"/>
-            <w:tcBorders>
-              <w:top w:val="single" w:sz="4" w:space="0" w:color="808080"/>
-              <w:left w:val="single" w:sz="4" w:space="0" w:color="808080"/>
-              <w:bottom w:val="single" w:sz="4" w:space="0" w:color="808080"/>
-              <w:right w:val="single" w:sz="4" w:space="0" w:color="808080"/>
-            </w:tcBorders>
-            <w:shd w:val="clear" w:color="auto" w:fill="F2F2F2"/>
-            <w:tcMar>
-              <w:top w:w="50" w:type="dxa"/>
-              <w:left w:w="100" w:type="dxa"/>
-              <w:bottom w:w="50" w:type="dxa"/>
-              <w:right w:w="100" w:type="dxa"/>
-            </w:tcMar>
+            <w:tcW w:w="2972" w:type="dxa"/>
             <w:tcBorders>
               <w:top w:val="single" w:sz="4" w:space="0" w:color="CCCCCC"/>
               <w:left w:val="single" w:sz="4" w:space="0" w:color="CCCCCC"/>
               <w:bottom w:val="single" w:sz="4" w:space="0" w:color="CCCCCC"/>
               <w:right w:val="single" w:sz="4" w:space="0" w:color="CCCCCC"/>
             </w:tcBorders>
+            <w:shd w:val="clear" w:color="auto" w:fill="F3F4F6"/>
             <w:tcMar>
               <w:top w:w="110" w:type="dxa"/>
+              <w:left w:w="160" w:type="dxa"/>
               <w:bottom w:w="110" w:type="dxa"/>
-              <w:left w:w="160" w:type="dxa"/>
               <w:right w:w="140" w:type="dxa"/>
             </w:tcMar>
-            <w:shd w:fill="F3F4F6"/>
           </w:tcPr>
           <w:p>
-            <w:pPr>
-              <w:spacing w:line="276" w:lineRule="auto" w:before="0" w:after="0"/>
-            </w:pPr>
-            <w:r/>
             <w:r>
               <w:rPr>
-                <w:rFonts w:ascii="Times New Roman" w:hAnsi="Times New Roman"/>
                 <w:b/>
-                <w:color w:val="1E293B"/>
-                <w:sz w:val="21"/>
               </w:rPr>
               <w:t>Tema Inovasi</w:t>
             </w:r>
@@ -491,91 +326,53 @@
         </w:tc>
         <w:tc>
           <w:tcPr>
-            <w:tcW w:w="5556" w:type="dxa"/>
-            <w:tcBorders>
-              <w:top w:val="single" w:sz="4" w:space="0" w:color="808080"/>
-              <w:left w:val="single" w:sz="4" w:space="0" w:color="808080"/>
-              <w:bottom w:val="single" w:sz="4" w:space="0" w:color="808080"/>
-              <w:right w:val="single" w:sz="4" w:space="0" w:color="808080"/>
-            </w:tcBorders>
-            <w:tcMar>
-              <w:top w:w="50" w:type="dxa"/>
-              <w:left w:w="100" w:type="dxa"/>
-              <w:bottom w:w="50" w:type="dxa"/>
-              <w:right w:w="100" w:type="dxa"/>
-            </w:tcMar>
+            <w:tcW w:w="4966" w:type="dxa"/>
             <w:tcBorders>
               <w:top w:val="single" w:sz="4" w:space="0" w:color="CCCCCC"/>
               <w:left w:val="single" w:sz="4" w:space="0" w:color="CCCCCC"/>
               <w:bottom w:val="single" w:sz="4" w:space="0" w:color="CCCCCC"/>
               <w:right w:val="single" w:sz="4" w:space="0" w:color="CCCCCC"/>
             </w:tcBorders>
+            <w:shd w:val="clear" w:color="auto" w:fill="FFFFFF"/>
             <w:tcMar>
               <w:top w:w="110" w:type="dxa"/>
+              <w:left w:w="160" w:type="dxa"/>
               <w:bottom w:w="110" w:type="dxa"/>
-              <w:left w:w="160" w:type="dxa"/>
               <w:right w:w="140" w:type="dxa"/>
             </w:tcMar>
-            <w:shd w:fill="FFFFFF"/>
           </w:tcPr>
           <w:p>
-            <w:pPr>
-              <w:spacing w:line="276" w:lineRule="auto" w:before="0" w:after="0"/>
-            </w:pPr>
-            <w:r/>
             <w:r>
-              <w:rPr>
-                <w:rFonts w:ascii="Times New Roman" w:hAnsi="Times New Roman"/>
-                <w:color w:val="0F172A"/>
-                <w:sz w:val="21"/>
-              </w:rPr>
               <w:t>Inovasi Pembelajaran</w:t>
             </w:r>
           </w:p>
         </w:tc>
       </w:tr>
       <w:tr>
+        <w:trPr>
+          <w:jc w:val="center"/>
+        </w:trPr>
         <w:tc>
           <w:tcPr>
-            <w:tcW w:w="2381" w:type="dxa"/>
-            <w:tcBorders>
-              <w:top w:val="single" w:sz="4" w:space="0" w:color="808080"/>
-              <w:left w:val="single" w:sz="4" w:space="0" w:color="808080"/>
-              <w:bottom w:val="single" w:sz="4" w:space="0" w:color="808080"/>
-              <w:right w:val="single" w:sz="4" w:space="0" w:color="808080"/>
-            </w:tcBorders>
-            <w:shd w:val="clear" w:color="auto" w:fill="F2F2F2"/>
-            <w:tcMar>
-              <w:top w:w="50" w:type="dxa"/>
-              <w:left w:w="100" w:type="dxa"/>
-              <w:bottom w:w="50" w:type="dxa"/>
-              <w:right w:w="100" w:type="dxa"/>
-            </w:tcMar>
+            <w:tcW w:w="2972" w:type="dxa"/>
             <w:tcBorders>
               <w:top w:val="single" w:sz="4" w:space="0" w:color="CCCCCC"/>
               <w:left w:val="single" w:sz="4" w:space="0" w:color="CCCCCC"/>
               <w:bottom w:val="single" w:sz="4" w:space="0" w:color="CCCCCC"/>
               <w:right w:val="single" w:sz="4" w:space="0" w:color="CCCCCC"/>
             </w:tcBorders>
+            <w:shd w:val="clear" w:color="auto" w:fill="F3F4F6"/>
             <w:tcMar>
               <w:top w:w="110" w:type="dxa"/>
+              <w:left w:w="160" w:type="dxa"/>
               <w:bottom w:w="110" w:type="dxa"/>
-              <w:left w:w="160" w:type="dxa"/>
               <w:right w:w="140" w:type="dxa"/>
             </w:tcMar>
-            <w:shd w:fill="F3F4F6"/>
           </w:tcPr>
           <w:p>
-            <w:pPr>
-              <w:spacing w:line="276" w:lineRule="auto" w:before="0" w:after="0"/>
-            </w:pPr>
-            <w:r/>
             <w:r>
               <w:rPr>
-                <w:rFonts w:ascii="Times New Roman" w:hAnsi="Times New Roman"/>
                 <w:b/>
-                <w:color w:val="1E293B"/>
-                <w:sz w:val="21"/>
               </w:rPr>
               <w:t>Satuan Pendidikan</w:t>
             </w:r>
@@ -583,145 +380,113 @@
         </w:tc>
         <w:tc>
           <w:tcPr>
-            <w:tcW w:w="5556" w:type="dxa"/>
-            <w:tcBorders>
-              <w:top w:val="single" w:sz="4" w:space="0" w:color="808080"/>
-              <w:left w:val="single" w:sz="4" w:space="0" w:color="808080"/>
-              <w:bottom w:val="single" w:sz="4" w:space="0" w:color="808080"/>
-              <w:right w:val="single" w:sz="4" w:space="0" w:color="808080"/>
-            </w:tcBorders>
-            <w:tcMar>
-              <w:top w:w="50" w:type="dxa"/>
-              <w:left w:w="100" w:type="dxa"/>
-              <w:bottom w:w="50" w:type="dxa"/>
-              <w:right w:w="100" w:type="dxa"/>
-            </w:tcMar>
+            <w:tcW w:w="4966" w:type="dxa"/>
             <w:tcBorders>
               <w:top w:val="single" w:sz="4" w:space="0" w:color="CCCCCC"/>
               <w:left w:val="single" w:sz="4" w:space="0" w:color="CCCCCC"/>
               <w:bottom w:val="single" w:sz="4" w:space="0" w:color="CCCCCC"/>
               <w:right w:val="single" w:sz="4" w:space="0" w:color="CCCCCC"/>
             </w:tcBorders>
+            <w:shd w:val="clear" w:color="auto" w:fill="FAFAFA"/>
             <w:tcMar>
               <w:top w:w="110" w:type="dxa"/>
+              <w:left w:w="160" w:type="dxa"/>
               <w:bottom w:w="110" w:type="dxa"/>
-              <w:left w:w="160" w:type="dxa"/>
               <w:right w:w="140" w:type="dxa"/>
             </w:tcMar>
-            <w:shd w:fill="FAFAFA"/>
           </w:tcPr>
           <w:p>
-            <w:pPr>
-              <w:spacing w:line="276" w:lineRule="auto" w:before="0" w:after="0"/>
-            </w:pPr>
-            <w:r/>
             <w:r>
-              <w:rPr>
-                <w:rFonts w:ascii="Times New Roman" w:hAnsi="Times New Roman"/>
-                <w:color w:val="0F172A"/>
-                <w:sz w:val="21"/>
-              </w:rPr>
               <w:t>SMP Negeri 2 Lamongan</w:t>
             </w:r>
           </w:p>
         </w:tc>
       </w:tr>
       <w:tr>
+        <w:trPr>
+          <w:jc w:val="center"/>
+        </w:trPr>
         <w:tc>
           <w:tcPr>
-            <w:tcW w:type="dxa" w:w="2381"/>
+            <w:tcW w:w="2972" w:type="dxa"/>
             <w:tcBorders>
               <w:top w:val="single" w:sz="4" w:space="0" w:color="CCCCCC"/>
               <w:left w:val="single" w:sz="4" w:space="0" w:color="CCCCCC"/>
               <w:bottom w:val="single" w:sz="4" w:space="0" w:color="CCCCCC"/>
               <w:right w:val="single" w:sz="4" w:space="0" w:color="CCCCCC"/>
             </w:tcBorders>
+            <w:shd w:val="clear" w:color="auto" w:fill="F3F4F6"/>
             <w:tcMar>
               <w:top w:w="110" w:type="dxa"/>
+              <w:left w:w="160" w:type="dxa"/>
               <w:bottom w:w="110" w:type="dxa"/>
-              <w:left w:w="160" w:type="dxa"/>
               <w:right w:w="140" w:type="dxa"/>
             </w:tcMar>
-            <w:shd w:fill="F3F4F6"/>
           </w:tcPr>
           <w:p>
-            <w:pPr>
-              <w:spacing w:line="276" w:lineRule="auto" w:before="0" w:after="0"/>
-            </w:pPr>
-            <w:r/>
             <w:r>
               <w:rPr>
-                <w:rFonts w:ascii="Times New Roman" w:hAnsi="Times New Roman"/>
                 <w:b/>
-                <w:color w:val="1E293B"/>
-                <w:sz w:val="21"/>
               </w:rPr>
-              <w:t>Alamat Satuan Pendidikan</w:t>
+              <w:t xml:space="preserve">Alamat </w:t>
+            </w:r>
+            <w:r>
+              <w:rPr>
+                <w:b/>
+              </w:rPr>
+              <w:t>Satuan Pendidikan</w:t>
             </w:r>
           </w:p>
         </w:tc>
         <w:tc>
           <w:tcPr>
-            <w:tcW w:type="dxa" w:w="5556"/>
+            <w:tcW w:w="4966" w:type="dxa"/>
             <w:tcBorders>
               <w:top w:val="single" w:sz="4" w:space="0" w:color="CCCCCC"/>
               <w:left w:val="single" w:sz="4" w:space="0" w:color="CCCCCC"/>
               <w:bottom w:val="single" w:sz="4" w:space="0" w:color="CCCCCC"/>
               <w:right w:val="single" w:sz="4" w:space="0" w:color="CCCCCC"/>
             </w:tcBorders>
+            <w:shd w:val="clear" w:color="auto" w:fill="FFFFFF"/>
             <w:tcMar>
               <w:top w:w="110" w:type="dxa"/>
+              <w:left w:w="160" w:type="dxa"/>
               <w:bottom w:w="110" w:type="dxa"/>
-              <w:left w:w="160" w:type="dxa"/>
               <w:right w:w="140" w:type="dxa"/>
             </w:tcMar>
-            <w:shd w:fill="FFFFFF"/>
           </w:tcPr>
           <w:p>
-            <w:pPr>
-              <w:spacing w:line="276" w:lineRule="auto" w:before="0" w:after="0"/>
-            </w:pPr>
-            <w:r/>
             <w:r>
-              <w:rPr>
-                <w:rFonts w:ascii="Times New Roman" w:hAnsi="Times New Roman"/>
-                <w:color w:val="0F172A"/>
-                <w:sz w:val="21"/>
-              </w:rPr>
               <w:t>Jl. Veteran No. 3, Kel. Banjarmendalan, Kec. Lamongan, Kab. Lamongan, Jawa Timur 62212</w:t>
             </w:r>
           </w:p>
         </w:tc>
       </w:tr>
       <w:tr>
+        <w:trPr>
+          <w:jc w:val="center"/>
+        </w:trPr>
         <w:tc>
           <w:tcPr>
-            <w:tcW w:type="dxa" w:w="2381"/>
+            <w:tcW w:w="2972" w:type="dxa"/>
             <w:tcBorders>
               <w:top w:val="single" w:sz="4" w:space="0" w:color="CCCCCC"/>
               <w:left w:val="single" w:sz="4" w:space="0" w:color="CCCCCC"/>
               <w:bottom w:val="single" w:sz="4" w:space="0" w:color="CCCCCC"/>
               <w:right w:val="single" w:sz="4" w:space="0" w:color="CCCCCC"/>
             </w:tcBorders>
+            <w:shd w:val="clear" w:color="auto" w:fill="F3F4F6"/>
             <w:tcMar>
               <w:top w:w="110" w:type="dxa"/>
+              <w:left w:w="160" w:type="dxa"/>
               <w:bottom w:w="110" w:type="dxa"/>
-              <w:left w:w="160" w:type="dxa"/>
               <w:right w:w="140" w:type="dxa"/>
             </w:tcMar>
-            <w:shd w:fill="F3F4F6"/>
           </w:tcPr>
           <w:p>
-            <w:pPr>
-              <w:spacing w:line="276" w:lineRule="auto" w:before="0" w:after="0"/>
-            </w:pPr>
-            <w:r/>
             <w:r>
               <w:rPr>
-                <w:rFonts w:ascii="Times New Roman" w:hAnsi="Times New Roman"/>
                 <w:b/>
-                <w:color w:val="1E293B"/>
-                <w:sz w:val="21"/>
               </w:rPr>
               <w:t>Mata Pelajaran / Sasaran</w:t>
             </w:r>
@@ -729,133 +494,53 @@
         </w:tc>
         <w:tc>
           <w:tcPr>
-            <w:tcW w:type="dxa" w:w="5556"/>
+            <w:tcW w:w="4966" w:type="dxa"/>
             <w:tcBorders>
               <w:top w:val="single" w:sz="4" w:space="0" w:color="CCCCCC"/>
               <w:left w:val="single" w:sz="4" w:space="0" w:color="CCCCCC"/>
               <w:bottom w:val="single" w:sz="4" w:space="0" w:color="CCCCCC"/>
               <w:right w:val="single" w:sz="4" w:space="0" w:color="CCCCCC"/>
             </w:tcBorders>
+            <w:shd w:val="clear" w:color="auto" w:fill="FAFAFA"/>
             <w:tcMar>
               <w:top w:w="110" w:type="dxa"/>
+              <w:left w:w="160" w:type="dxa"/>
               <w:bottom w:w="110" w:type="dxa"/>
-              <w:left w:w="160" w:type="dxa"/>
               <w:right w:w="140" w:type="dxa"/>
             </w:tcMar>
-            <w:shd w:fill="FAFAFA"/>
           </w:tcPr>
           <w:p>
-            <w:pPr>
-              <w:spacing w:line="276" w:lineRule="auto" w:before="0" w:after="0"/>
-            </w:pPr>
-            <w:r/>
             <w:r>
-              <w:rPr>
-                <w:rFonts w:ascii="Times New Roman" w:hAnsi="Times New Roman"/>
-                <w:color w:val="0F172A"/>
-                <w:sz w:val="21"/>
-              </w:rPr>
-              <w:t>Informatika / Fase D (Kelas IX)</w:t>
+              <w:t xml:space="preserve">Informatika / Fase D </w:t>
             </w:r>
           </w:p>
         </w:tc>
       </w:tr>
       <w:tr>
+        <w:trPr>
+          <w:jc w:val="center"/>
+        </w:trPr>
         <w:tc>
           <w:tcPr>
-            <w:tcW w:type="dxa" w:w="2381"/>
+            <w:tcW w:w="2972" w:type="dxa"/>
             <w:tcBorders>
               <w:top w:val="single" w:sz="4" w:space="0" w:color="CCCCCC"/>
               <w:left w:val="single" w:sz="4" w:space="0" w:color="CCCCCC"/>
               <w:bottom w:val="single" w:sz="4" w:space="0" w:color="CCCCCC"/>
               <w:right w:val="single" w:sz="4" w:space="0" w:color="CCCCCC"/>
             </w:tcBorders>
+            <w:shd w:val="clear" w:color="auto" w:fill="F3F4F6"/>
             <w:tcMar>
               <w:top w:w="110" w:type="dxa"/>
+              <w:left w:w="160" w:type="dxa"/>
               <w:bottom w:w="110" w:type="dxa"/>
-              <w:left w:w="160" w:type="dxa"/>
               <w:right w:w="140" w:type="dxa"/>
             </w:tcMar>
-            <w:shd w:fill="F3F4F6"/>
           </w:tcPr>
           <w:p>
-            <w:pPr>
-              <w:spacing w:line="276" w:lineRule="auto" w:before="0" w:after="0"/>
-            </w:pPr>
-            <w:r/>
             <w:r>
               <w:rPr>
-                <w:rFonts w:ascii="Times New Roman" w:hAnsi="Times New Roman"/>
                 <w:b/>
-                <w:color w:val="1E293B"/>
-                <w:sz w:val="21"/>
-              </w:rPr>
-              <w:t>Judul Karya Inovasi</w:t>
-            </w:r>
-          </w:p>
-        </w:tc>
-        <w:tc>
-          <w:tcPr>
-            <w:tcW w:type="dxa" w:w="5556"/>
-            <w:tcBorders>
-              <w:top w:val="single" w:sz="4" w:space="0" w:color="CCCCCC"/>
-              <w:left w:val="single" w:sz="4" w:space="0" w:color="CCCCCC"/>
-              <w:bottom w:val="single" w:sz="4" w:space="0" w:color="CCCCCC"/>
-              <w:right w:val="single" w:sz="4" w:space="0" w:color="CCCCCC"/>
-            </w:tcBorders>
-            <w:tcMar>
-              <w:top w:w="110" w:type="dxa"/>
-              <w:bottom w:w="110" w:type="dxa"/>
-              <w:left w:w="160" w:type="dxa"/>
-              <w:right w:w="140" w:type="dxa"/>
-            </w:tcMar>
-            <w:shd w:fill="FFFFFF"/>
-          </w:tcPr>
-          <w:p>
-            <w:pPr>
-              <w:spacing w:line="276" w:lineRule="auto" w:before="0" w:after="0"/>
-            </w:pPr>
-            <w:r/>
-            <w:r>
-              <w:rPr>
-                <w:rFonts w:ascii="Times New Roman" w:hAnsi="Times New Roman"/>
-                <w:color w:val="0F172A"/>
-                <w:sz w:val="21"/>
-              </w:rPr>
-              <w:t>Menyelam ke Dalam Mesin Digital: Inovasi Media Pembelajaran Interaktif Sistem Komputer Berbasis Web di SMP Negeri 2 Lamongan</w:t>
-            </w:r>
-          </w:p>
-        </w:tc>
-      </w:tr>
-      <w:tr>
-        <w:tc>
-          <w:tcPr>
-            <w:tcW w:type="dxa" w:w="2381"/>
-            <w:tcBorders>
-              <w:top w:val="single" w:sz="4" w:space="0" w:color="CCCCCC"/>
-              <w:left w:val="single" w:sz="4" w:space="0" w:color="CCCCCC"/>
-              <w:bottom w:val="single" w:sz="4" w:space="0" w:color="CCCCCC"/>
-              <w:right w:val="single" w:sz="4" w:space="0" w:color="CCCCCC"/>
-            </w:tcBorders>
-            <w:tcMar>
-              <w:top w:w="110" w:type="dxa"/>
-              <w:bottom w:w="110" w:type="dxa"/>
-              <w:left w:w="160" w:type="dxa"/>
-              <w:right w:w="140" w:type="dxa"/>
-            </w:tcMar>
-            <w:shd w:fill="F3F4F6"/>
-          </w:tcPr>
-          <w:p>
-            <w:pPr>
-              <w:spacing w:line="276" w:lineRule="auto" w:before="0" w:after="0"/>
-            </w:pPr>
-            <w:r/>
-            <w:r>
-              <w:rPr>
-                <w:rFonts w:ascii="Times New Roman" w:hAnsi="Times New Roman"/>
-                <w:b/>
-                <w:color w:val="1E293B"/>
-                <w:sz w:val="21"/>
               </w:rPr>
               <w:t>Tautan Media (MPI)</w:t>
             </w:r>
@@ -863,67 +548,58 @@
         </w:tc>
         <w:tc>
           <w:tcPr>
-            <w:tcW w:type="dxa" w:w="5556"/>
+            <w:tcW w:w="4966" w:type="dxa"/>
             <w:tcBorders>
               <w:top w:val="single" w:sz="4" w:space="0" w:color="CCCCCC"/>
               <w:left w:val="single" w:sz="4" w:space="0" w:color="CCCCCC"/>
               <w:bottom w:val="single" w:sz="4" w:space="0" w:color="CCCCCC"/>
               <w:right w:val="single" w:sz="4" w:space="0" w:color="CCCCCC"/>
             </w:tcBorders>
+            <w:shd w:val="clear" w:color="auto" w:fill="FAFAFA"/>
             <w:tcMar>
               <w:top w:w="110" w:type="dxa"/>
+              <w:left w:w="160" w:type="dxa"/>
               <w:bottom w:w="110" w:type="dxa"/>
-              <w:left w:w="160" w:type="dxa"/>
               <w:right w:w="140" w:type="dxa"/>
             </w:tcMar>
-            <w:shd w:fill="FAFAFA"/>
           </w:tcPr>
           <w:p>
-            <w:pPr>
-              <w:spacing w:line="276" w:lineRule="auto" w:before="0" w:after="0"/>
-            </w:pPr>
-            <w:r/>
-            <w:r>
-              <w:rPr>
-                <w:rFonts w:ascii="Times New Roman" w:hAnsi="Times New Roman"/>
-                <w:color w:val="0E7490"/>
-                <w:sz w:val="21"/>
-                <w:u w:val="none"/>
-              </w:rPr>
-              <w:t>https://fanani.my.id/lab/mpi/sistem-komputer/</w:t>
-            </w:r>
+            <w:hyperlink r:id="rId7" w:history="1">
+              <w:r>
+                <w:rPr>
+                  <w:rStyle w:val="Hyperlink"/>
+                </w:rPr>
+                <w:t>https://fanani.my.id/lab/mpi/sistem-komputer/</w:t>
+              </w:r>
+            </w:hyperlink>
           </w:p>
         </w:tc>
       </w:tr>
       <w:tr>
+        <w:trPr>
+          <w:jc w:val="center"/>
+        </w:trPr>
         <w:tc>
           <w:tcPr>
-            <w:tcW w:type="dxa" w:w="2381"/>
+            <w:tcW w:w="2972" w:type="dxa"/>
             <w:tcBorders>
               <w:top w:val="single" w:sz="4" w:space="0" w:color="CCCCCC"/>
               <w:left w:val="single" w:sz="4" w:space="0" w:color="CCCCCC"/>
               <w:bottom w:val="single" w:sz="4" w:space="0" w:color="CCCCCC"/>
               <w:right w:val="single" w:sz="4" w:space="0" w:color="CCCCCC"/>
             </w:tcBorders>
+            <w:shd w:val="clear" w:color="auto" w:fill="F3F4F6"/>
             <w:tcMar>
               <w:top w:w="110" w:type="dxa"/>
+              <w:left w:w="160" w:type="dxa"/>
               <w:bottom w:w="110" w:type="dxa"/>
-              <w:left w:w="160" w:type="dxa"/>
               <w:right w:w="140" w:type="dxa"/>
             </w:tcMar>
-            <w:shd w:fill="F3F4F6"/>
           </w:tcPr>
           <w:p>
-            <w:pPr>
-              <w:spacing w:line="276" w:lineRule="auto" w:before="0" w:after="0"/>
-            </w:pPr>
-            <w:r/>
             <w:r>
               <w:rPr>
-                <w:rFonts w:ascii="Times New Roman" w:hAnsi="Times New Roman"/>
                 <w:b/>
-                <w:color w:val="1E293B"/>
-                <w:sz w:val="21"/>
               </w:rPr>
               <w:t>Portofolio Laboratorium</w:t>
             </w:r>
@@ -931,67 +607,58 @@
         </w:tc>
         <w:tc>
           <w:tcPr>
-            <w:tcW w:type="dxa" w:w="5556"/>
+            <w:tcW w:w="4966" w:type="dxa"/>
             <w:tcBorders>
               <w:top w:val="single" w:sz="4" w:space="0" w:color="CCCCCC"/>
               <w:left w:val="single" w:sz="4" w:space="0" w:color="CCCCCC"/>
               <w:bottom w:val="single" w:sz="4" w:space="0" w:color="CCCCCC"/>
               <w:right w:val="single" w:sz="4" w:space="0" w:color="CCCCCC"/>
             </w:tcBorders>
+            <w:shd w:val="clear" w:color="auto" w:fill="FFFFFF"/>
             <w:tcMar>
               <w:top w:w="110" w:type="dxa"/>
+              <w:left w:w="160" w:type="dxa"/>
               <w:bottom w:w="110" w:type="dxa"/>
-              <w:left w:w="160" w:type="dxa"/>
               <w:right w:w="140" w:type="dxa"/>
             </w:tcMar>
-            <w:shd w:fill="FFFFFF"/>
           </w:tcPr>
           <w:p>
-            <w:pPr>
-              <w:spacing w:line="276" w:lineRule="auto" w:before="0" w:after="0"/>
-            </w:pPr>
-            <w:r/>
-            <w:r>
-              <w:rPr>
-                <w:rFonts w:ascii="Times New Roman" w:hAnsi="Times New Roman"/>
-                <w:color w:val="0E7490"/>
-                <w:sz w:val="21"/>
-                <w:u w:val="none"/>
-              </w:rPr>
-              <w:t>https://fanani.my.id/lab/</w:t>
-            </w:r>
+            <w:hyperlink r:id="rId8" w:history="1">
+              <w:r>
+                <w:rPr>
+                  <w:rStyle w:val="Hyperlink"/>
+                </w:rPr>
+                <w:t>https://fanani.my.id/lab/</w:t>
+              </w:r>
+            </w:hyperlink>
           </w:p>
         </w:tc>
       </w:tr>
       <w:tr>
+        <w:trPr>
+          <w:jc w:val="center"/>
+        </w:trPr>
         <w:tc>
           <w:tcPr>
-            <w:tcW w:type="dxa" w:w="2381"/>
+            <w:tcW w:w="2972" w:type="dxa"/>
             <w:tcBorders>
               <w:top w:val="single" w:sz="4" w:space="0" w:color="CCCCCC"/>
               <w:left w:val="single" w:sz="4" w:space="0" w:color="CCCCCC"/>
               <w:bottom w:val="single" w:sz="4" w:space="0" w:color="CCCCCC"/>
               <w:right w:val="single" w:sz="4" w:space="0" w:color="CCCCCC"/>
             </w:tcBorders>
+            <w:shd w:val="clear" w:color="auto" w:fill="F3F4F6"/>
             <w:tcMar>
               <w:top w:w="110" w:type="dxa"/>
+              <w:left w:w="160" w:type="dxa"/>
               <w:bottom w:w="110" w:type="dxa"/>
-              <w:left w:w="160" w:type="dxa"/>
               <w:right w:w="140" w:type="dxa"/>
             </w:tcMar>
-            <w:shd w:fill="F3F4F6"/>
           </w:tcPr>
           <w:p>
-            <w:pPr>
-              <w:spacing w:line="276" w:lineRule="auto" w:before="0" w:after="0"/>
-            </w:pPr>
-            <w:r/>
             <w:r>
               <w:rPr>
-                <w:rFonts w:ascii="Times New Roman" w:hAnsi="Times New Roman"/>
                 <w:b/>
-                <w:color w:val="1E293B"/>
-                <w:sz w:val="21"/>
               </w:rPr>
               <w:t>Repositori Kode Sumber</w:t>
             </w:r>
@@ -999,67 +666,58 @@
         </w:tc>
         <w:tc>
           <w:tcPr>
-            <w:tcW w:type="dxa" w:w="5556"/>
+            <w:tcW w:w="4966" w:type="dxa"/>
             <w:tcBorders>
               <w:top w:val="single" w:sz="4" w:space="0" w:color="CCCCCC"/>
               <w:left w:val="single" w:sz="4" w:space="0" w:color="CCCCCC"/>
               <w:bottom w:val="single" w:sz="4" w:space="0" w:color="CCCCCC"/>
               <w:right w:val="single" w:sz="4" w:space="0" w:color="CCCCCC"/>
             </w:tcBorders>
+            <w:shd w:val="clear" w:color="auto" w:fill="FAFAFA"/>
             <w:tcMar>
               <w:top w:w="110" w:type="dxa"/>
+              <w:left w:w="160" w:type="dxa"/>
               <w:bottom w:w="110" w:type="dxa"/>
-              <w:left w:w="160" w:type="dxa"/>
               <w:right w:w="140" w:type="dxa"/>
             </w:tcMar>
-            <w:shd w:fill="FAFAFA"/>
           </w:tcPr>
           <w:p>
-            <w:pPr>
-              <w:spacing w:line="276" w:lineRule="auto" w:before="0" w:after="0"/>
-            </w:pPr>
-            <w:r/>
-            <w:r>
-              <w:rPr>
-                <w:rFonts w:ascii="Times New Roman" w:hAnsi="Times New Roman"/>
-                <w:color w:val="0E7490"/>
-                <w:sz w:val="21"/>
-                <w:u w:val="none"/>
-              </w:rPr>
-              <w:t>https://github.com/chanif/chanif.github.io</w:t>
-            </w:r>
+            <w:hyperlink r:id="rId9" w:history="1">
+              <w:r>
+                <w:rPr>
+                  <w:rStyle w:val="Hyperlink"/>
+                </w:rPr>
+                <w:t>https://github.com/chanif/chanif.github.io</w:t>
+              </w:r>
+            </w:hyperlink>
           </w:p>
         </w:tc>
       </w:tr>
       <w:tr>
+        <w:trPr>
+          <w:jc w:val="center"/>
+        </w:trPr>
         <w:tc>
           <w:tcPr>
-            <w:tcW w:type="dxa" w:w="2381"/>
+            <w:tcW w:w="2972" w:type="dxa"/>
             <w:tcBorders>
               <w:top w:val="single" w:sz="4" w:space="0" w:color="CCCCCC"/>
               <w:left w:val="single" w:sz="4" w:space="0" w:color="CCCCCC"/>
               <w:bottom w:val="single" w:sz="4" w:space="0" w:color="CCCCCC"/>
               <w:right w:val="single" w:sz="4" w:space="0" w:color="CCCCCC"/>
             </w:tcBorders>
+            <w:shd w:val="clear" w:color="auto" w:fill="F3F4F6"/>
             <w:tcMar>
               <w:top w:w="110" w:type="dxa"/>
+              <w:left w:w="160" w:type="dxa"/>
               <w:bottom w:w="110" w:type="dxa"/>
-              <w:left w:w="160" w:type="dxa"/>
               <w:right w:w="140" w:type="dxa"/>
             </w:tcMar>
-            <w:shd w:fill="F3F4F6"/>
           </w:tcPr>
           <w:p>
-            <w:pPr>
-              <w:spacing w:line="276" w:lineRule="auto" w:before="0" w:after="0"/>
-            </w:pPr>
-            <w:r/>
             <w:r>
               <w:rPr>
-                <w:rFonts w:ascii="Times New Roman" w:hAnsi="Times New Roman"/>
                 <w:b/>
-                <w:color w:val="1E293B"/>
-                <w:sz w:val="21"/>
               </w:rPr>
               <w:t>Surel (Email)</w:t>
             </w:r>
@@ -1067,112 +725,127 @@
         </w:tc>
         <w:tc>
           <w:tcPr>
-            <w:tcW w:type="dxa" w:w="5556"/>
+            <w:tcW w:w="4966" w:type="dxa"/>
             <w:tcBorders>
               <w:top w:val="single" w:sz="4" w:space="0" w:color="CCCCCC"/>
               <w:left w:val="single" w:sz="4" w:space="0" w:color="CCCCCC"/>
               <w:bottom w:val="single" w:sz="4" w:space="0" w:color="CCCCCC"/>
               <w:right w:val="single" w:sz="4" w:space="0" w:color="CCCCCC"/>
             </w:tcBorders>
+            <w:shd w:val="clear" w:color="auto" w:fill="FFFFFF"/>
             <w:tcMar>
               <w:top w:w="110" w:type="dxa"/>
+              <w:left w:w="160" w:type="dxa"/>
               <w:bottom w:w="110" w:type="dxa"/>
-              <w:left w:w="160" w:type="dxa"/>
               <w:right w:w="140" w:type="dxa"/>
             </w:tcMar>
-            <w:shd w:fill="FFFFFF"/>
           </w:tcPr>
           <w:p>
-            <w:pPr>
-              <w:spacing w:line="276" w:lineRule="auto" w:before="0" w:after="0"/>
-            </w:pPr>
-            <w:r/>
+            <w:hyperlink r:id="rId10" w:history="1">
+              <w:r>
+                <w:rPr>
+                  <w:rStyle w:val="Hyperlink"/>
+                </w:rPr>
+                <w:t>chanifuddin@gmail.com</w:t>
+              </w:r>
+            </w:hyperlink>
             <w:r>
-              <w:rPr>
-                <w:rFonts w:ascii="Times New Roman" w:hAnsi="Times New Roman"/>
-                <w:color w:val="0F172A"/>
-                <w:sz w:val="21"/>
-              </w:rPr>
-              <w:t>chanifuddin@gmail.com / pak@fanani.my.id</w:t>
+              <w:t xml:space="preserve"> / </w:t>
             </w:r>
+            <w:hyperlink r:id="rId11" w:history="1">
+              <w:r>
+                <w:rPr>
+                  <w:rStyle w:val="Hyperlink"/>
+                </w:rPr>
+                <w:t>pak@fanani.my.id</w:t>
+              </w:r>
+            </w:hyperlink>
+            <w:bookmarkStart w:id="0" w:name="_GoBack"/>
+            <w:bookmarkEnd w:id="0"/>
           </w:p>
         </w:tc>
       </w:tr>
       <w:tr>
+        <w:trPr>
+          <w:jc w:val="center"/>
+        </w:trPr>
         <w:tc>
           <w:tcPr>
-            <w:tcW w:type="dxa" w:w="2381"/>
+            <w:tcW w:w="2972" w:type="dxa"/>
             <w:tcBorders>
               <w:top w:val="single" w:sz="4" w:space="0" w:color="CCCCCC"/>
               <w:left w:val="single" w:sz="4" w:space="0" w:color="CCCCCC"/>
               <w:bottom w:val="single" w:sz="4" w:space="0" w:color="CCCCCC"/>
               <w:right w:val="single" w:sz="4" w:space="0" w:color="CCCCCC"/>
             </w:tcBorders>
+            <w:shd w:val="clear" w:color="auto" w:fill="F3F4F6"/>
             <w:tcMar>
               <w:top w:w="110" w:type="dxa"/>
+              <w:left w:w="160" w:type="dxa"/>
               <w:bottom w:w="110" w:type="dxa"/>
-              <w:left w:w="160" w:type="dxa"/>
               <w:right w:w="140" w:type="dxa"/>
             </w:tcMar>
-            <w:shd w:fill="F3F4F6"/>
           </w:tcPr>
           <w:p>
             <w:pPr>
-              <w:spacing w:line="276" w:lineRule="auto" w:before="0" w:after="0"/>
+              <w:rPr>
+                <w:lang w:val="en-US"/>
+              </w:rPr>
             </w:pPr>
-            <w:r/>
             <w:r>
               <w:rPr>
-                <w:rFonts w:ascii="Times New Roman" w:hAnsi="Times New Roman"/>
                 <w:b/>
-                <w:color w:val="1E293B"/>
-                <w:sz w:val="21"/>
               </w:rPr>
-              <w:t>Nomor Telepon / WhatsApp</w:t>
+              <w:t xml:space="preserve">Nomor Telepon / </w:t>
+            </w:r>
+            <w:r>
+              <w:rPr>
+                <w:b/>
+                <w:lang w:val="en-US"/>
+              </w:rPr>
+              <w:t>WA</w:t>
             </w:r>
           </w:p>
         </w:tc>
         <w:tc>
           <w:tcPr>
-            <w:tcW w:type="dxa" w:w="5556"/>
+            <w:tcW w:w="4966" w:type="dxa"/>
             <w:tcBorders>
               <w:top w:val="single" w:sz="4" w:space="0" w:color="CCCCCC"/>
               <w:left w:val="single" w:sz="4" w:space="0" w:color="CCCCCC"/>
               <w:bottom w:val="single" w:sz="4" w:space="0" w:color="CCCCCC"/>
               <w:right w:val="single" w:sz="4" w:space="0" w:color="CCCCCC"/>
             </w:tcBorders>
+            <w:shd w:val="clear" w:color="auto" w:fill="FAFAFA"/>
             <w:tcMar>
               <w:top w:w="110" w:type="dxa"/>
+              <w:left w:w="160" w:type="dxa"/>
               <w:bottom w:w="110" w:type="dxa"/>
-              <w:left w:w="160" w:type="dxa"/>
               <w:right w:w="140" w:type="dxa"/>
             </w:tcMar>
-            <w:shd w:fill="FAFAFA"/>
           </w:tcPr>
           <w:p>
-            <w:pPr>
-              <w:spacing w:line="276" w:lineRule="auto" w:before="0" w:after="0"/>
-            </w:pPr>
-            <w:r/>
             <w:r>
-              <w:rPr>
-                <w:rFonts w:ascii="Times New Roman" w:hAnsi="Times New Roman"/>
-                <w:color w:val="0F172A"/>
-                <w:sz w:val="21"/>
-              </w:rPr>
               <w:t>+62 815-8885-508</w:t>
             </w:r>
           </w:p>
         </w:tc>
       </w:tr>
     </w:tbl>
+    <w:p/>
     <w:p>
       <w:pPr>
         <w:pStyle w:val="Heading1"/>
         <w:keepNext/>
         <w:spacing w:before="240" w:after="120"/>
-      </w:pPr>
-      <w:r>
+        <w:rPr>
+          <w:color w:val="auto"/>
+        </w:rPr>
+      </w:pPr>
+      <w:r>
+        <w:rPr>
+          <w:color w:val="auto"/>
+        </w:rPr>
         <w:t>I. PENDAHULUAN</w:t>
       </w:r>
     </w:p>
@@ -1183,7 +856,13 @@
         <w:jc w:val="both"/>
       </w:pPr>
       <w:r>
-        <w:t>Perkembangan teknologi digital menuntut guru tidak sekadar menguasai materi, tetapi juga merancang pembelajaran yang adaptif dan berpusat pada murid. Tema Inovasi Pembelajaran mengajak guru menghadirkan pendekatan, media, dan asesmen yang lebih relevan dan efektif dalam menjawab kebutuhan murid, sehingga materi abstrak dapat dipahami secara berkesadaran, bermakna, dan menggembirakan.</w:t>
+        <w:t xml:space="preserve">Perkembangan teknologi digital menuntut guru tidak sekadar menguasai materi, tetapi juga </w:t>
+      </w:r>
+      <w:r>
+        <w:t>merancang pembelajaran yang adaptif dan berpusat pada murid. Tema Inovasi Pembelajaran mengajak guru menghadirkan pendekatan, media, dan asesmen yang lebih relevan dan efektif dalam menjawab kebutuhan murid, sehingga materi abstrak dapat dipahami secara be</w:t>
+      </w:r>
+      <w:r>
+        <w:t>rkesadaran, bermakna, dan menggembirakan.</w:t>
       </w:r>
     </w:p>
     <w:p>
@@ -1193,6 +872,7 @@
         <w:jc w:val="both"/>
       </w:pPr>
       <w:r>
+        <w:lastRenderedPageBreak/>
         <w:t xml:space="preserve">Saya mengampu Informatika di SMP Negeri 2 Lamongan pada delapan dari sepuluh rombongan belajar kelas IX (9A–9H). Murid-murid saya fasih mengoperasikan gawai, tetapi sebagian besar belum memahami apa yang terjadi di balik layar saat gawai disentuh. Ceramah, bagan statis di buku teks, dan </w:t>
       </w:r>
       <w:r>
@@ -1213,7 +893,10 @@
         <w:jc w:val="both"/>
       </w:pPr>
       <w:r>
-        <w:t xml:space="preserve">Menjawab persoalan itu, saya mengembangkan Media Pembelajaran Interaktif (MPI) berbasis web berjudul “Menyelam ke Dalam Mesin Digital” pada menu “Lab” di domain pribadi fanani.my.id. Saya membangunnya dengan HTML5, CSS3, dan JavaScript murni, dibantu Google Antigravity melalui pendekatan </w:t>
+        <w:t>Menjawab persoalan itu, saya mengembangkan Media Pembela</w:t>
+      </w:r>
+      <w:r>
+        <w:t xml:space="preserve">jaran Interaktif (MPI) berbasis web berjudul “Menyelam ke Dalam Mesin Digital” pada menu “Lab” di domain pribadi fanani.my.id. Saya membangunnya dengan HTML5, CSS3, dan JavaScript murni, dibantu Google Antigravity melalui pendekatan </w:t>
       </w:r>
       <w:r>
         <w:rPr>
@@ -1223,7 +906,10 @@
         <w:t>vibe coding</w:t>
       </w:r>
       <w:r>
-        <w:t>, yakni menyusun program lewat dialog dengan asisten AI. Media dapat diakses gratis melalui peramban pada panel interaktif kelas (</w:t>
+        <w:t>, yakni meny</w:t>
+      </w:r>
+      <w:r>
+        <w:t>usun program lewat dialog dengan asisten AI. Media dapat diakses gratis melalui peramban pada panel interaktif kelas (</w:t>
       </w:r>
       <w:r>
         <w:rPr>
@@ -1233,11 +919,10 @@
         <w:t>Interactive Flat Panel</w:t>
       </w:r>
       <w:r>
-        <w:t xml:space="preserve">/IFP) maupun komputer lab, dan penerapannya di kelas terekam dalam video narasi praktik baik yang menyertai naskah ini. Tujuan saya jelas: murid memahami </w:t>
-      </w:r>
-      <w:r>
-        <w:lastRenderedPageBreak/>
-        <w:t>cara kerja komputer melalui pengalaman mencoba langsung, bukan menghafal istilah.</w:t>
+        <w:t>/IFP) maupun komputer lab, dan penerapannya di kelas terekam dalam video narasi praktik baik yang menyertai naskah i</w:t>
+      </w:r>
+      <w:r>
+        <w:t>ni. Tujuan saya jelas: murid memahami cara kerja komputer melalui pengalaman mencoba langsung, bukan menghafal istilah.</w:t>
       </w:r>
     </w:p>
     <w:p>
@@ -1245,8 +930,14 @@
         <w:pStyle w:val="Heading1"/>
         <w:keepNext/>
         <w:spacing w:before="240" w:after="120"/>
-      </w:pPr>
-      <w:r>
+        <w:rPr>
+          <w:color w:val="auto"/>
+        </w:rPr>
+      </w:pPr>
+      <w:r>
+        <w:rPr>
+          <w:color w:val="auto"/>
+        </w:rPr>
         <w:t>II. ISI (DESKRIPSI PRAKTIK BAIK)</w:t>
       </w:r>
     </w:p>
@@ -1255,8 +946,14 @@
         <w:pStyle w:val="Heading2"/>
         <w:keepNext/>
         <w:spacing w:before="160" w:after="100"/>
-      </w:pPr>
-      <w:r>
+        <w:rPr>
+          <w:color w:val="auto"/>
+        </w:rPr>
+      </w:pPr>
+      <w:r>
+        <w:rPr>
+          <w:color w:val="auto"/>
+        </w:rPr>
         <w:t>A. Situasi: Latar Belakang Masalah dan Urgensi Inovasi</w:t>
       </w:r>
     </w:p>
@@ -1267,7 +964,10 @@
         <w:jc w:val="both"/>
       </w:pPr>
       <w:r>
-        <w:t>Elemen Sistem Komputer dalam Informatika Fase D (Kurikulum Merdeka) menuntut murid membedah cara kerja komputer: Segitiga Emas (</w:t>
+        <w:t xml:space="preserve">Elemen Sistem Komputer dalam Informatika Fase D </w:t>
+      </w:r>
+      <w:r>
+        <w:t>(Kurikulum Merdeka) menuntut murid membedah cara kerja komputer: Segitiga Emas (</w:t>
       </w:r>
       <w:r>
         <w:rPr>
@@ -1347,7 +1047,10 @@
         <w:t>Store</w:t>
       </w:r>
       <w:r>
-        <w:t>), perbedaan RAM yang volatil dengan SSD yang non-volatil, serta peran sistem operasi. Materi ini sangat abstrak karena yang dipelajari adalah proses yang tidak terlihat.</w:t>
+        <w:t>), perbedaan RAM yang volatil dengan SSD yang no</w:t>
+      </w:r>
+      <w:r>
+        <w:t>n-volatil, serta peran sistem operasi. Materi ini sangat abstrak karena yang dipelajari adalah proses yang tidak terlihat.</w:t>
       </w:r>
     </w:p>
     <w:p>
@@ -1357,10 +1060,16 @@
         <w:jc w:val="both"/>
       </w:pPr>
       <w:r>
-        <w:rPr>
-          <w:rFonts w:ascii="Times New Roman" w:hAnsi="Times New Roman"/>
-        </w:rPr>
-        <w:t>Kesulitan tersebut merata di delapan rombel yang saya ampu. Agar perbaikan pembelajaran lebih teramati dan terukur, kelas 9A (35 murid) saya tetapkan sebagai kelas sampel. Asesmen awal menunjukkan hasil yang memprihatinkan: hanya 13 dari 35 murid yang mencapai Kriteria Ketercapaian Tujuan Pembelajaran (KKTP ≥ 75), dengan rata-rata kelas hanya 58,40. Melalui observasi dan interaksi di kelas, murid tampak ragu dan cemas merusak komponen mahal atau tersengat listrik statis jika diminta memegang perangkat secara langsung. Sebagian besar murid juga merasa diagram statis di buku teks belum membantu mereka membayangkan aliran data biner pada prosesor dan memori.</w:t>
+        <w:t>Kesulitan tersebut merata di delapan rombel yang saya ampu. Agar perbaikan pembelajaran lebih teramati dan terukur, kelas 9A (35 muri</w:t>
+      </w:r>
+      <w:r>
+        <w:t>d) saya tetapkan sebagai kelas sampel. Asesmen awal menunjukkan hasil yang memprihatinkan: hanya 13 dari 35 murid yang mencapai Kriteria Ketercapaian Tujuan Pembelajaran (KKTP ≥ 75), dengan rata-rata kelas hanya 58,40. Melalui observasi dan interaksi di ke</w:t>
+      </w:r>
+      <w:r>
+        <w:t>las, murid tampak ragu dan cemas merusak komponen mahal atau tersengat listrik statis jika diminta memegang perangkat secara langsung. Sebagian besar murid juga merasa diagram statis di buku teks belum membantu mereka membayangkan aliran data biner pada pr</w:t>
+      </w:r>
+      <w:r>
+        <w:t>osesor dan memori.</w:t>
       </w:r>
     </w:p>
     <w:p>
@@ -1370,7 +1079,14 @@
         <w:jc w:val="both"/>
       </w:pPr>
       <w:r>
-        <w:t>Keterbatasan sarana memperberat keadaan. Laboratorium kami hanya memiliki satu unit CPU terbuka untuk didemonstrasikan kepada 35 murid (rasio 1:35), sehingga merakit komputer fisik bagi setiap murid mustahil dilakukan dalam waktu tatap muka yang tersedia. Kondisi ini menegaskan kebutuhan akan laboratorium virtual yang aman, bebas biaya komponen, dan dapat diakses dari IFP, komputer lab, maupun rumah.</w:t>
+        <w:t>Keterbatasan sarana memperberat keadaan. Laboratorium kami hanya memiliki satu unit CPU terbuka untuk didemonstrasikan kepada 35 murid (rasio 1:35), sehingga merakit komputer fisik bagi setiap murid mustahil dilakukan dalam waktu tatap m</w:t>
+      </w:r>
+      <w:r>
+        <w:t xml:space="preserve">uka yang tersedia. Kondisi ini menegaskan kebutuhan akan </w:t>
+      </w:r>
+      <w:r>
+        <w:lastRenderedPageBreak/>
+        <w:t>laboratorium virtual yang aman, bebas biaya komponen, dan dapat diakses dari IFP, komputer lab, maupun rumah.</w:t>
       </w:r>
     </w:p>
     <w:p>
@@ -1378,8 +1094,14 @@
         <w:pStyle w:val="Heading2"/>
         <w:keepNext/>
         <w:spacing w:before="160" w:after="100"/>
-      </w:pPr>
-      <w:r>
+        <w:rPr>
+          <w:color w:val="auto"/>
+        </w:rPr>
+      </w:pPr>
+      <w:r>
+        <w:rPr>
+          <w:color w:val="auto"/>
+        </w:rPr>
         <w:t>B. Tantangan: Kendala dalam Mencapai Tujuan Praktik</w:t>
       </w:r>
     </w:p>
@@ -1397,7 +1119,10 @@
         <w:t>Tantangan teknis.</w:t>
       </w:r>
       <w:r>
-        <w:t xml:space="preserve"> Meski telah berpengalaman lebih dari 12 tahun sebagai </w:t>
+        <w:t xml:space="preserve"> Meski telah berpeng</w:t>
+      </w:r>
+      <w:r>
+        <w:t xml:space="preserve">alaman lebih dari 12 tahun sebagai </w:t>
       </w:r>
       <w:r>
         <w:rPr>
@@ -1407,7 +1132,10 @@
         <w:t>full stack web developer</w:t>
       </w:r>
       <w:r>
-        <w:t xml:space="preserve">, saya tetap menghadapi tantangan menyelaraskan standar rekayasa perangkat lunak profesional dengan kebutuhan pedagogis murid SMP. Media ini memuat 21 halaman modular: enam bagian materi, video siklus CPU, simulator perakitan PC virtual berbasis </w:t>
+        <w:t>, saya tetap menghadapi tantangan menyelaraskan standar rekayasa perangkat lunak profesional dengan kebutuhan pedagogis murid SMP. Media ini memuat 21 halaman modular: enam bagian materi, video sik</w:t>
+      </w:r>
+      <w:r>
+        <w:t xml:space="preserve">lus CPU, simulator perakitan PC virtual berbasis </w:t>
       </w:r>
       <w:r>
         <w:rPr>
@@ -1427,7 +1155,10 @@
         <w:t>getBoundingClientRect</w:t>
       </w:r>
       <w:r>
-        <w:t xml:space="preserve">) dan sensitivitas sentuhan agar komponen terkunci presisi pada soket </w:t>
+        <w:t>) dan sensitivitas sentuhan agar komponen terkunci presisi pada soket</w:t>
+      </w:r>
+      <w:r>
+        <w:t xml:space="preserve"> </w:t>
       </w:r>
       <w:r>
         <w:rPr>
@@ -1454,11 +1185,10 @@
         <w:t>Etika pemanfaatan AI.</w:t>
       </w:r>
       <w:r>
-        <w:t xml:space="preserve"> Penggunaan AI dalam pendidikan sering dicurigai mengikis orisinalitas karya guru. Saya ingin menunjukkan bahwa AI dapat menjadi mitra kerja yang etis, bukan pengganti, sekaligus meneladankan kejujuran </w:t>
-      </w:r>
-      <w:r>
-        <w:lastRenderedPageBreak/>
-        <w:t xml:space="preserve">akademik kepada murid dengan mencantumkan </w:t>
+        <w:t xml:space="preserve"> Penggunaan AI dalam pendidikan sering dicurigai mengikis orisinalitas karya guru. Saya ingin menunjukkan bahwa AI dapat menjadi mitra kerja yang eti</w:t>
+      </w:r>
+      <w:r>
+        <w:t xml:space="preserve">s, bukan pengganti, sekaligus meneladankan kejujuran akademik kepada murid dengan mencantumkan </w:t>
       </w:r>
       <w:r>
         <w:rPr>
@@ -1495,7 +1225,10 @@
         <w:t>drag-and-drop</w:t>
       </w:r>
       <w:r>
-        <w:t xml:space="preserve"> harus tetap terbaca jelas dari bangku belakang kelas serta tidak bergeser pada resolusi layar yang berbeda.</w:t>
+        <w:t xml:space="preserve"> harus tetap terbaca jelas dari bangku belakang kelas serta tidak bergeser pada resolu</w:t>
+      </w:r>
+      <w:r>
+        <w:t>si layar yang berbeda.</w:t>
       </w:r>
     </w:p>
     <w:p>
@@ -1520,9 +1253,21 @@
         <w:pStyle w:val="Heading2"/>
         <w:keepNext/>
         <w:spacing w:before="160" w:after="100"/>
-      </w:pPr>
-      <w:r>
-        <w:t>C. Aksi: Langkah Strategis dan Pelaksanaan Pembelajaran</w:t>
+        <w:rPr>
+          <w:color w:val="auto"/>
+        </w:rPr>
+      </w:pPr>
+      <w:r>
+        <w:rPr>
+          <w:color w:val="auto"/>
+        </w:rPr>
+        <w:t>C. Aksi: Langkah S</w:t>
+      </w:r>
+      <w:r>
+        <w:rPr>
+          <w:color w:val="auto"/>
+        </w:rPr>
+        <w:t>trategis dan Pelaksanaan Pembelajaran</w:t>
       </w:r>
     </w:p>
     <w:p>
@@ -1542,7 +1287,10 @@
         <w:t>Analysis, Design, Development, Implementation, Evaluation</w:t>
       </w:r>
       <w:r>
-        <w:t>) yang dipadukan dengan inkuiri terbimbing. Alur belajarnya bergerak dari memahami konsep lewat materi visual, menerapkannya lewat simulator, hingga merefleksikannya lewat kuis dan lembar refleksi, sejalan dengan prinsip pembelajaran mendalam.</w:t>
+        <w:t>) yang dipadukan dengan inkuiri terbimbing. Alur belajarnya bergerak dari memahami konsep lewat materi visual, men</w:t>
+      </w:r>
+      <w:r>
+        <w:t>erapkannya lewat simulator, hingga merefleksikannya lewat kuis dan lembar refleksi, sejalan dengan prinsip pembelajaran mendalam.</w:t>
       </w:r>
     </w:p>
     <w:p>
@@ -1559,7 +1307,10 @@
         <w:t>Analisis.</w:t>
       </w:r>
       <w:r>
-        <w:t xml:space="preserve"> Saya mengkaji Capaian Pembelajaran Informatika Fase D elemen Sistem Komputer beserta data diagnostik, lalu merumuskan empat tujuan pembelajaran: (1) menjelaskan Segitiga Emas; (2) mengidentifikasi empat pilar perangkat keras dan fungsi </w:t>
+        <w:t xml:space="preserve"> Saya mengkaji Capaian Pembelajaran Informatika Fase D elemen Sistem Komputer beserta data diagnostik, lalu merumuska</w:t>
+      </w:r>
+      <w:r>
+        <w:t xml:space="preserve">n empat tujuan pembelajaran: (1) menjelaskan Segitiga Emas; (2) mengidentifikasi empat pilar perangkat keras dan fungsi </w:t>
       </w:r>
       <w:r>
         <w:rPr>
@@ -1579,7 +1330,10 @@
         <w:t>Fetch–Decode–Execute–Store</w:t>
       </w:r>
       <w:r>
-        <w:t xml:space="preserve"> serta perbedaan RAM dan SSD; dan (4) menjelaskan peran sistem operasi.</w:t>
+        <w:t xml:space="preserve"> serta perbedaan RAM dan SSD; dan (4) menjelaskan peran sistem operasi</w:t>
+      </w:r>
+      <w:r>
+        <w:t>.</w:t>
       </w:r>
     </w:p>
     <w:p>
@@ -1593,6 +1347,7 @@
           <w:b/>
           <w:bCs/>
         </w:rPr>
+        <w:lastRenderedPageBreak/>
         <w:t>Desain.</w:t>
       </w:r>
       <w:r>
@@ -1616,7 +1371,10 @@
         <w:t>Quick Controls Card</w:t>
       </w:r>
       <w:r>
-        <w:t xml:space="preserve">) menyediakan pembesaran tampilan dan pengaturan ukuran huruf (A− / A+) agar media tetap terbaca dari bangku belakang. Materi dikaitkan dengan kehidupan murid lewat analogi, misalnya </w:t>
+        <w:t>) menyediakan pembesaran tampilan dan pengaturan ukuran huruf (A− / A+) agar media tetap terbaca dari bangku belakang. Materi dikaitkan</w:t>
+      </w:r>
+      <w:r>
+        <w:t xml:space="preserve"> dengan kehidupan murid lewat analogi, misalnya </w:t>
       </w:r>
       <w:r>
         <w:rPr>
@@ -1643,7 +1401,10 @@
         <w:t>Pengembangan.</w:t>
       </w:r>
       <w:r>
-        <w:t xml:space="preserve"> Media dibangun dengan standar web terbuka tanpa pustaka eksternal yang memberatkan. Google Antigravity membantu mempercepat penulisan algoritma interaktif dan kalibrasi deteksi koordinat, sedangkan rancangan pembelajaran dan keputusan pedagogisnya tetap saya yang menentukan. Media ini terdiri atas:</w:t>
+        <w:t xml:space="preserve"> Media dibangun dengan standar web terbuka tanpa pustaka eksternal yang memberatkan. Google Antigravity membantu memperc</w:t>
+      </w:r>
+      <w:r>
+        <w:t>epat penulisan algoritma interaktif dan kalibrasi deteksi koordinat, sedangkan rancangan pembelajaran dan keputusan pedagogisnya tetap saya yang menentukan. Media ini terdiri atas:</w:t>
       </w:r>
     </w:p>
     <w:p>
@@ -1658,7 +1419,10 @@
         <w:jc w:val="both"/>
       </w:pPr>
       <w:r>
-        <w:t xml:space="preserve">enam bagian materi: Sistem Komputer &amp; Segitiga Emas, Uji Praktik Menjodohkan Hardware, Perangkat Keras &amp; </w:t>
+        <w:t>enam bagian materi: Sistem Komputer &amp; Segitiga Emas, Uji Praktik Menjodohka</w:t>
+      </w:r>
+      <w:r>
+        <w:t xml:space="preserve">n Hardware, Perangkat Keras &amp; </w:t>
       </w:r>
       <w:r>
         <w:rPr>
@@ -1703,11 +1467,10 @@
         <w:t>booting</w:t>
       </w:r>
       <w:r>
-        <w:t xml:space="preserve">), sakelar biner (konversi desimal ke biner dan karakter ASCII), pemecahan masalah layar gelap, dan pemecahan </w:t>
-      </w:r>
-      <w:r>
-        <w:lastRenderedPageBreak/>
-        <w:t>masalah memori penuh. Rak komponen sengaja memuat komponen pengecoh, misalnya RAM DDR2 lawas dan adaptor daya 10 W, sehingga murid harus menalar kompatibilitas, bukan sekadar menyeret;</w:t>
+        <w:t>), sakelar biner (konversi desimal ke biner dan karakter ASCII), pemecahan masalah layar gelap, dan pemecahan masalah memori penuh. Rak komponen sengaja memuat komponen pengecoh, misalnya RAM DDR2 lawas dan adaptor daya 10 W, sehingga murid harus menalar k</w:t>
+      </w:r>
+      <w:r>
+        <w:t>ompatibilitas, bukan sekadar menyeret;</w:t>
       </w:r>
     </w:p>
     <w:p>
@@ -1772,7 +1535,10 @@
         <w:t>prompt</w:t>
       </w:r>
       <w:r>
-        <w:t xml:space="preserve"> seluruh aset gambar buatan AI dan video siklus CPU buatan Google Vids, sekaligus menandai bagian orisinal seperti diagram SVG komponen komputer dan logo resmi.</w:t>
+        <w:t xml:space="preserve"> </w:t>
+      </w:r>
+      <w:r>
+        <w:t>seluruh aset gambar buatan AI dan video siklus CPU buatan Google Vids, sekaligus menandai bagian orisinal seperti diagram SVG komponen komputer dan logo resmi.</w:t>
       </w:r>
     </w:p>
     <w:p>
@@ -1789,7 +1555,10 @@
         <w:t>Implementasi.</w:t>
       </w:r>
       <w:r>
-        <w:t xml:space="preserve"> Pembelajaran dilaksanakan di kelas sampel 9A dan saya rekam dalam video narasi praktik baik yang menyertai naskah ini. Video memvisualisasikan alur inovasi pembelajaran secara naratif dan memuat cuplikan tiga tahap kegiatan di kelas:</w:t>
+        <w:t xml:space="preserve"> Pembelajaran dilaksanakan di kelas sampel 9A dan saya rekam dalam video narasi pra</w:t>
+      </w:r>
+      <w:r>
+        <w:t>ktik baik yang menyertai naskah ini. Video memvisualisasikan alur inovasi pembelajaran secara naratif dan memuat cuplikan tiga tahap kegiatan di kelas:</w:t>
       </w:r>
     </w:p>
     <w:p>
@@ -1806,7 +1575,10 @@
         <w:t>Kegiatan pembuka.</w:t>
       </w:r>
       <w:r>
-        <w:t xml:space="preserve"> Saya memantik rasa ingin tahu murid tentang apa yang terjadi di balik layar gawai saat dinyalakan, lalu mengajak mereka membuka media “Menyelam ke Dalam Mesin Digital”.</w:t>
+        <w:t xml:space="preserve"> Saya memantik rasa ingin tahu murid tentang apa yang terjadi di balik layar gawai saat</w:t>
+      </w:r>
+      <w:r>
+        <w:t xml:space="preserve"> dinyalakan, lalu mengajak mereka membuka media “Menyelam ke Dalam Mesin Digital”.</w:t>
       </w:r>
     </w:p>
     <w:p>
@@ -1833,7 +1605,10 @@
         <w:t>motherboard</w:t>
       </w:r>
       <w:r>
-        <w:t>, mengamati video siklus CPU, dan menuntaskan misi pada simulator perakitan virtual tanpa rasa cemas. Ketika murid salah menempatkan komponen, indikator merah menyala disertai pesan diagnostik yang ramah. Peran saya bergeser dari penyampai materi searah menjadi fasilitator.</w:t>
+        <w:t>, mengamati video siklus CPU, dan m</w:t>
+      </w:r>
+      <w:r>
+        <w:t>enuntaskan misi pada simulator perakitan virtual tanpa rasa cemas. Ketika murid salah menempatkan komponen, indikator merah menyala disertai pesan diagnostik yang ramah. Peran saya bergeser dari penyampai materi searah menjadi fasilitator.</w:t>
       </w:r>
     </w:p>
     <w:p>
@@ -1847,7 +1622,15 @@
           <w:i/>
           <w:iCs/>
         </w:rPr>
-        <w:t>Kegiatan penutup.</w:t>
+        <w:lastRenderedPageBreak/>
+        <w:t>Kegiatan penutup</w:t>
+      </w:r>
+      <w:r>
+        <w:rPr>
+          <w:i/>
+          <w:iCs/>
+        </w:rPr>
+        <w:t>.</w:t>
       </w:r>
       <w:r>
         <w:t xml:space="preserve"> Murid mengerjakan kuis evaluasi empat format untuk mengukur pemahaman seketika, dilanjutkan diskusi kelas dan pengisian lembar refleksi digital.</w:t>
@@ -1860,7 +1643,10 @@
         <w:jc w:val="both"/>
       </w:pPr>
       <w:r>
-        <w:t>Setelah kelas 9A, praktik ini saya perluas ke kelas 9B–9H dan saya bagikan kepada rekan sejawat pengampu kelas 9I dan 9J.</w:t>
+        <w:t>Setelah kelas 9A, praktik ini saya perluas ke kelas 9B–9H dan saya bagikan kepada rekan sejawat pengampu kela</w:t>
+      </w:r>
+      <w:r>
+        <w:t>s 9I dan 9J.</w:t>
       </w:r>
     </w:p>
     <w:p>
@@ -1877,7 +1663,10 @@
         <w:t>Evaluasi.</w:t>
       </w:r>
       <w:r>
-        <w:t xml:space="preserve"> Berdasarkan masukan murid dan catatan observasi kelas, saya menyempurnakan media secara berkelanjutan: mengoptimalkan kecepatan muat (kurang dari 2 detik), memperbaiki kontras warna demi kenyamanan mata, dan menyetel sensitivitas sentuhan layar.</w:t>
+        <w:t xml:space="preserve"> Berdasarkan masukan murid dan catatan observasi kelas, saya menyempurnakan media secara berkelanjutan: mengoptimalkan kecepatan muat (kurang dari 2 detik), memperbaiki kontras warna demi kenyamanan mata, dan menyetel sensitivitas sen</w:t>
+      </w:r>
+      <w:r>
+        <w:t>tuhan layar.</w:t>
       </w:r>
     </w:p>
     <w:p>
@@ -1899,60 +1688,21 @@
       <w:r>
         <w:t xml:space="preserve">, </w:t>
       </w:r>
-      <w:proofErr w:type="spellStart"/>
-      <w:r>
-        <w:rPr>
-          <w:i/>
-          <w:iCs/>
-        </w:rPr>
-        <w:t>Github</w:t>
-      </w:r>
-      <w:proofErr w:type="spellEnd"/>
-      <w:r>
-        <w:rPr>
-          <w:i/>
-          <w:iCs/>
-        </w:rPr>
-        <w:t xml:space="preserve"> </w:t>
-      </w:r>
-      <w:proofErr w:type="spellStart"/>
-      <w:r>
-        <w:rPr>
-          <w:i/>
-          <w:iCs/>
-        </w:rPr>
-        <w:t>Pages</w:t>
-      </w:r>
-      <w:proofErr w:type="spellEnd"/>
-      <w:r>
-        <w:t xml:space="preserve"> (</w:t>
-      </w:r>
-      <w:proofErr w:type="spellStart"/>
-      <w:r>
-        <w:t>hosting</w:t>
-      </w:r>
-      <w:proofErr w:type="spellEnd"/>
-      <w:r>
-        <w:t xml:space="preserve"> gratis)</w:t>
-      </w:r>
-      <w:r>
-        <w:t xml:space="preserve">, Google </w:t>
-      </w:r>
-      <w:proofErr w:type="spellStart"/>
-      <w:r>
-        <w:t>Antigravity</w:t>
-      </w:r>
-      <w:proofErr w:type="spellEnd"/>
-      <w:r>
-        <w:t xml:space="preserve">, Google </w:t>
-      </w:r>
-      <w:proofErr w:type="spellStart"/>
-      <w:r>
-        <w:t>Vids</w:t>
-      </w:r>
-      <w:proofErr w:type="spellEnd"/>
-      <w:r>
-        <w:t>, serta IFP dan komputer lab. Pihak yang terlibat adalah 35 murid kelas 9A, murid kelas 9B–9H, guru pengampu kelas 9I–9J, serta Dinas Pendidikan Kabupaten Lamongan dan Musyawarah Guru Mata Pelajaran (MGMP) Informatika sebagai mitra pengimbasan.</w:t>
+      <w:r>
+        <w:rPr>
+          <w:i/>
+          <w:iCs/>
+        </w:rPr>
+        <w:t>Github Pages</w:t>
+      </w:r>
+      <w:r>
+        <w:t xml:space="preserve"> (hosting gratis)</w:t>
+      </w:r>
+      <w:r>
+        <w:t>, Google Antigravity, Google Vids, serta IFP dan komputer lab. Pihak yang terlibat adalah 35 murid kelas 9A, murid k</w:t>
+      </w:r>
+      <w:r>
+        <w:t>elas 9B–9H, guru pengampu kelas 9I–9J, serta Dinas Pendidikan Kabupaten Lamongan dan Musyawarah Guru Mata Pelajaran (MGMP) Informatika sebagai mitra pengimbasan.</w:t>
       </w:r>
     </w:p>
     <w:p>
@@ -1960,9 +1710,14 @@
         <w:pStyle w:val="Heading2"/>
         <w:keepNext/>
         <w:spacing w:before="160" w:after="100"/>
-      </w:pPr>
-      <w:r>
-        <w:lastRenderedPageBreak/>
+        <w:rPr>
+          <w:color w:val="auto"/>
+        </w:rPr>
+      </w:pPr>
+      <w:r>
+        <w:rPr>
+          <w:color w:val="auto"/>
+        </w:rPr>
         <w:t>D. Dampak: Hasil, Respons, dan Refleksi</w:t>
       </w:r>
     </w:p>
@@ -1973,10 +1728,13 @@
         <w:jc w:val="both"/>
       </w:pPr>
       <w:r>
-        <w:rPr>
-          <w:rFonts w:ascii="Times New Roman" w:hAnsi="Times New Roman"/>
-        </w:rPr>
-        <w:t>Hasil belajar. Pada kelas sampel 9A (35 murid), pemahaman murid meningkat signifikan. Nilai rata-rata kelas melonjak dari 58,40 pada asesmen awal menjadi 86,80 pada evaluasi akhir modul. Jumlah murid yang mencapai ketuntasan (KKTP) meningkat tajam, dari semula hanya 13 murid menjadi 32 dari 35 murid. Sebagian besar murid juga mampu menyelesaikan soal penalaran tingkat tinggi terkait analisis siklus kerja CPU dan studi kasus spesifikasi perangkat keras dengan baik.</w:t>
+        <w:t>Hasil belajar. Pada kelas sampel 9A (35 murid), pemaha</w:t>
+      </w:r>
+      <w:r>
+        <w:t>man murid meningkat signifikan. Nilai rata-rata kelas melonjak dari 58,40 pada asesmen awal menjadi 86,80 pada evaluasi akhir modul. Jumlah murid yang mencapai ketuntasan (KKTP) meningkat tajam, dari semula hanya 13 murid menjadi 32 dari 35 murid. Sebagian</w:t>
+      </w:r>
+      <w:r>
+        <w:t xml:space="preserve"> besar murid juga mampu menyelesaikan soal penalaran tingkat tinggi terkait analisis siklus kerja CPU dan studi kasus spesifikasi perangkat keras dengan baik.</w:t>
       </w:r>
     </w:p>
     <w:p>
@@ -1986,10 +1744,13 @@
         <w:jc w:val="both"/>
       </w:pPr>
       <w:r>
-        <w:rPr>
-          <w:rFonts w:ascii="Times New Roman" w:hAnsi="Times New Roman"/>
-        </w:rPr>
-        <w:t>Antusiasme dan kemandirian belajar. Sikap belajar murid menunjukkan perubahan yang sangat positif. Rasa cemas dan takut salah berganti dengan rasa ingin tahu yang tinggi karena simulator virtual memberi ruang yang aman bagi mereka untuk bereksperimen. Murid menjadi aktif mencoba, berani berdiskusi, dan tidak lagi ragu membedah alur kerja komputer. Menariknya, sekitar 25 dari 35 murid secara sukarela mengakses kembali media ini dari rumah di luar jam pelajaran untuk mengulang simulasi dan memantapkan pemahaman mereka. Pada kelas 9B–9H yang juga memakai media ini, saya mengamati antusiasme yang serupa.</w:t>
+        <w:t>Antusiasme dan kemandirian belajar. Sikap belajar murid menunjukkan perubahan yang sangat positif</w:t>
+      </w:r>
+      <w:r>
+        <w:t>. Rasa cemas dan takut salah berganti dengan rasa ingin tahu yang tinggi karena simulator virtual memberi ruang yang aman bagi mereka untuk bereksperimen. Murid menjadi aktif mencoba, berani berdiskusi, dan tidak lagi ragu membedah alur kerja komputer. Men</w:t>
+      </w:r>
+      <w:r>
+        <w:t>ariknya, sekitar 25 dari 35 murid secara sukarela mengakses kembali media ini dari rumah di luar jam pelajaran untuk mengulang simulasi dan memantapkan pemahaman mereka. Pada kelas 9B–9H yang juga memakai media ini, saya mengamati antusiasme yang serupa.</w:t>
       </w:r>
     </w:p>
     <w:p>
@@ -2003,7 +1764,14 @@
           <w:b/>
           <w:bCs/>
         </w:rPr>
-        <w:t>Literasi digital dan etika AI.</w:t>
+        <w:t>L</w:t>
+      </w:r>
+      <w:r>
+        <w:rPr>
+          <w:b/>
+          <w:bCs/>
+        </w:rPr>
+        <w:t>iterasi digital dan etika AI.</w:t>
       </w:r>
       <w:r>
         <w:t xml:space="preserve"> Keterbukaan tentang peran AI dalam pembuatan aset media menjadi contoh nyata bagi murid tentang pemanfaatan kecerdasan artifisial secara jujur dan kritis.</w:t>
@@ -2023,7 +1791,17 @@
         <w:t>Pengimbasan.</w:t>
       </w:r>
       <w:r>
-        <w:t xml:space="preserve"> Dampak inovasi ini meluas melampaui kelas saya. Saya dipercaya Dinas Pendidikan Kabupaten Lamongan menjadi narasumber “Sosialisasi Pembelajaran Mendalam dan Koding &amp; Kecerdasan Artifisial Tahun Pelajaran 2026/2027” pada 15 September 2026, yang dihadiri perwakilan guru SMP negeri dan swasta se-Kabupaten Lamongan. Di forum itu saya mempresentasikan media ini sekaligus melatih para guru membuat MPI berbasis web secara mandiri melalui </w:t>
+        <w:t xml:space="preserve"> Dampak inovasi ini meluas melampaui kelas saya. Saya diper</w:t>
+      </w:r>
+      <w:r>
+        <w:t xml:space="preserve">caya Dinas Pendidikan Kabupaten Lamongan menjadi narasumber “Sosialisasi Pembelajaran Mendalam dan Koding &amp; Kecerdasan Artifisial Tahun Pelajaran 2026/2027” pada 15 September 2026, yang dihadiri perwakilan guru SMP </w:t>
+      </w:r>
+      <w:r>
+        <w:lastRenderedPageBreak/>
+        <w:t xml:space="preserve">negeri dan swasta se-Kabupaten Lamongan. </w:t>
+      </w:r>
+      <w:r>
+        <w:t xml:space="preserve">Di forum itu saya mempresentasikan media ini sekaligus melatih para guru membuat MPI berbasis web secara mandiri melalui </w:t>
       </w:r>
       <w:r>
         <w:rPr>
@@ -2043,7 +1821,13 @@
         <w:t>prompt</w:t>
       </w:r>
       <w:r>
-        <w:t xml:space="preserve"> terstruktur untuk menghasilkan logika simulasi interaktif tanpa menghafal sintaksis rumit, hingga mempublikasikannya gratis lewat GitHub Pages. Pelatihan ini menunjukkan bahwa koding dan media interaktif dapat dibuat oleh siapa saja, sehingga para guru termotivasi merancang media mandiri di sekolah masing-masing. Media ini juga saya imbaskan secara intensif lewat MGMP Informatika Kabupaten Lamongan.</w:t>
+        <w:t xml:space="preserve"> terstruktur untuk menghasilkan logika simulasi interaktif tanpa menghafal sin</w:t>
+      </w:r>
+      <w:r>
+        <w:t>taksis rumit, hingga mempublikasikannya gratis lewat GitHub Pages. Pelatihan ini menunjukkan bahwa koding dan media interaktif dapat dibuat oleh siapa saja, sehingga para guru termotivasi merancang media mandiri di sekolah masing-masing. Media ini juga say</w:t>
+      </w:r>
+      <w:r>
+        <w:t>a imbaskan secara intensif lewat MGMP Informatika Kabupaten Lamongan.</w:t>
       </w:r>
     </w:p>
     <w:p>
@@ -2060,7 +1844,13 @@
         <w:t>Refleksi: efektivitas dan faktor keberhasilan.</w:t>
       </w:r>
       <w:r>
-        <w:t xml:space="preserve"> Menurut saya, praktik ini efektif karena menjawab dua akar masalah sekaligus: materi yang tidak kasatmata menjadi terlihat dan dapat dicoba, serta rasa takut merusak perangkat berkurang karena kesalahan di simulator tidak berbiaya. Faktor keberhasilan lainnya adalah umpan balik langsung dari simulator dan kuis multiformat, serta akses daring gratis yang memungkinkan murid mengulang belajar di rumah. Undangan menjadi narasumber dan antusiasme rekan guru menjadi tanda bahwa praktik ini relevan dan berdaya imbas bagi peningkatan mutu pembelajaran di tingkat daerah.</w:t>
+        <w:t xml:space="preserve"> Menurut saya, praktik ini efektif karena menjawab dua akar masalah sekaligus: materi yang tidak kasatmata menjadi terlihat dan dapat dicoba</w:t>
+      </w:r>
+      <w:r>
+        <w:t>, serta rasa takut merusak perangkat berkurang karena kesalahan di simulator tidak berbiaya. Faktor keberhasilan lainnya adalah umpan balik langsung dari simulator dan kuis multiformat, serta akses daring gratis yang memungkinkan murid mengulang belajar di</w:t>
+      </w:r>
+      <w:r>
+        <w:t xml:space="preserve"> rumah. Undangan menjadi narasumber dan antusiasme rekan guru menjadi tanda bahwa praktik ini relevan dan berdaya imbas bagi peningkatan mutu pembelajaran di tingkat daerah.</w:t>
       </w:r>
     </w:p>
     <w:p>
@@ -2070,10 +1860,10 @@
         <w:jc w:val="both"/>
       </w:pPr>
       <w:r>
-        <w:rPr>
-          <w:rFonts w:ascii="Times New Roman" w:hAnsi="Times New Roman"/>
-        </w:rPr>
-        <w:t>Refleksi: keterbatasan. Tiga murid belum mencapai KKTP, sehingga media ini tentu bukan solusi tunggal; murid yang masih mengalami kesulitan tetap memerlukan bimbingan dan pendampingan personal secara langsung dari guru. Selain itu, media ini masih memerlukan koneksi internet saat pertama kali dibuka di peramban.</w:t>
+        <w:t xml:space="preserve">Refleksi: keterbatasan. Tiga murid belum mencapai KKTP, sehingga media ini </w:t>
+      </w:r>
+      <w:r>
+        <w:t>tentu bukan solusi tunggal; murid yang masih mengalami kesulitan tetap memerlukan bimbingan dan pendampingan personal secara langsung dari guru. Selain itu, media ini masih memerlukan koneksi internet saat pertama kali dibuka di peramban.</w:t>
       </w:r>
     </w:p>
     <w:p>
@@ -2087,10 +1877,23 @@
           <w:b/>
           <w:bCs/>
         </w:rPr>
-        <w:t>Refleksi: pembelajaran.</w:t>
-      </w:r>
-      <w:r>
-        <w:t xml:space="preserve"> Saya belajar bahwa AI mempercepat pekerjaan teknis, tetapi mutu pembelajaran tetap bergantung pada kejelasan tujuan dan kebutuhan murid yang saya tetapkan sendiri. Saya juga belajar bahwa media yang baik lahir dari uji coba berulang bersama murid, karena masukan merekalah yang mendorong perbaikan media. Keterbatasan sarana bukan penghalang inovasi, melainkan pemantik kreativitas pendidik. Dengan pemanfaatan AI yang bijak, guru dapat menjadi kreator media mandiri tanpa bergantung pada perangkat mahal, selaras dengan motto di media: “Berkarya untuk Negeri Melalui Digitalisasi Pembelajaran Inovatif Berdampak.”</w:t>
+        <w:t>Refleksi: pembela</w:t>
+      </w:r>
+      <w:r>
+        <w:rPr>
+          <w:b/>
+          <w:bCs/>
+        </w:rPr>
+        <w:t>jaran.</w:t>
+      </w:r>
+      <w:r>
+        <w:t xml:space="preserve"> Saya belajar bahwa AI mempercepat pekerjaan teknis, tetapi mutu pembelajaran tetap bergantung pada kejelasan tujuan dan kebutuhan murid yang saya tetapkan sendiri. Saya juga belajar bahwa media yang baik lahir dari uji coba berulang bersama murid, k</w:t>
+      </w:r>
+      <w:r>
+        <w:t>arena masukan merekalah yang mendorong perbaikan media. Keterbatasan sarana bukan penghalang inovasi, melainkan pemantik kreativitas pendidik. Dengan pemanfaatan AI yang bijak, guru dapat menjadi kreator media mandiri tanpa bergantung pada perangkat mahal,</w:t>
+      </w:r>
+      <w:r>
+        <w:t xml:space="preserve"> selaras dengan motto di media: “Berkarya untuk Negeri Melalui Digitalisasi Pembelajaran Inovatif Berdampak.”</w:t>
       </w:r>
     </w:p>
     <w:p>
@@ -2117,7 +1920,10 @@
         <w:t>Progressive Web App</w:t>
       </w:r>
       <w:r>
-        <w:t xml:space="preserve"> (PWA) agar media dapat diakses sepenuhnya secara luring, memberikan pendampingan lanjutan bagi murid yang belum tuntas, dan memperluas simulasi ke elemen Jaringan Komputer dan Internet serta Algoritma dan Pemrograman.</w:t>
+        <w:t xml:space="preserve"> (PWA) agar media dapat diakses sepenuhnya secara luring, memberikan pend</w:t>
+      </w:r>
+      <w:r>
+        <w:t>ampingan lanjutan bagi murid yang belum tuntas, dan memperluas simulasi ke elemen Jaringan Komputer dan Internet serta Algoritma dan Pemrograman.</w:t>
       </w:r>
     </w:p>
     <w:p>
@@ -2125,8 +1931,14 @@
         <w:pStyle w:val="Heading1"/>
         <w:keepNext/>
         <w:spacing w:before="240" w:after="120"/>
-      </w:pPr>
-      <w:r>
+        <w:rPr>
+          <w:color w:val="auto"/>
+        </w:rPr>
+      </w:pPr>
+      <w:r>
+        <w:rPr>
+          <w:color w:val="auto"/>
+        </w:rPr>
         <w:t>III. PENUTUP</w:t>
       </w:r>
     </w:p>
@@ -2137,7 +1949,17 @@
         <w:jc w:val="both"/>
       </w:pPr>
       <w:r>
-        <w:t>Praktik “Menyelam ke Dalam Mesin Digital” menunjukkan bahwa materi Sistem Komputer yang abstrak dapat diubah menjadi pengalaman belajar yang aman, bermakna, dan menggembirakan melalui media interaktif buatan guru sendiri. Gagasan yang bermula dari keresahan di ruang kelas kini dipakai murid kelas IX SMP Negeri 2 Lamongan untuk memahami nalar di balik mesin digital. Karena media ini dapat diakses gratis, guru lain dapat langsung menggunakannya atau mengadaptasi pendekatannya untuk materi Informatika lainnya.</w:t>
+        <w:t>Praktik “Menyelam ke Dalam Mesin Digital” menunjukkan bahwa materi Sistem Komputer yang abstrak d</w:t>
+      </w:r>
+      <w:r>
+        <w:t xml:space="preserve">apat diubah menjadi pengalaman belajar yang aman, bermakna, dan menggembirakan melalui media interaktif buatan guru sendiri. Gagasan yang bermula dari keresahan di ruang kelas kini dipakai murid </w:t>
+      </w:r>
+      <w:r>
+        <w:lastRenderedPageBreak/>
+        <w:t xml:space="preserve">kelas IX SMP Negeri 2 Lamongan untuk memahami nalar di balik </w:t>
+      </w:r>
+      <w:r>
+        <w:t>mesin digital. Karena media ini dapat diakses gratis, guru lain dapat langsung menggunakannya atau mengadaptasi pendekatannya untuk materi Informatika lainnya.</w:t>
       </w:r>
     </w:p>
     <w:p>
@@ -2147,7 +1969,13 @@
         <w:jc w:val="both"/>
       </w:pPr>
       <w:r>
-        <w:t>Inovasi pembelajaran tidak diukur dari mahalnya perangkat, melainkan dari seberapa dalam ia menyentuh nalar dan menumbuhkan kemandirian belajar murid. Melalui Apresiasi GTK Transformatif 2026, saya berharap praktik dari ruang kelas di Lamongan ini dapat menginspirasi rekan pendidik di seluruh Indonesia untuk berani berinovasi demi Generasi Emas Indonesia.</w:t>
+        <w:t>Inovasi pembelajaran tidak diukur dari mahalnya perangkat, melainkan dari seberapa dalam ia meny</w:t>
+      </w:r>
+      <w:r>
+        <w:t>entuh nalar dan menumbuhkan kemandirian belajar murid. Melalui Apresiasi GTK Transformatif 2026, saya berharap praktik dari ruang kelas di Lamongan ini dapat menginspirasi rekan pendidik di seluruh Indonesia untuk berani berinovasi demi Generasi Emas Indon</w:t>
+      </w:r>
+      <w:r>
+        <w:t>esia.</w:t>
       </w:r>
     </w:p>
     <w:p>
@@ -2183,7 +2011,22 @@
         <w:ind w:left="4535"/>
       </w:pPr>
       <w:r>
-        <w:t>Lamongan, Oktober 2026</w:t>
+        <w:t xml:space="preserve">Lamongan, </w:t>
+      </w:r>
+      <w:r>
+        <w:rPr>
+          <w:lang w:val="en-US"/>
+        </w:rPr>
+        <w:t>2</w:t>
+      </w:r>
+      <w:r>
+        <w:rPr>
+          <w:lang w:val="en-US"/>
+        </w:rPr>
+        <w:t xml:space="preserve"> </w:t>
+      </w:r>
+      <w:r>
+        <w:t>Oktober 2026</w:t>
       </w:r>
     </w:p>
     <w:p>
@@ -2208,7 +2051,7 @@
           <w:noProof/>
         </w:rPr>
         <w:drawing>
-          <wp:anchor distT="0" distB="0" distL="114300" distR="114300" simplePos="0" relativeHeight="251658240" behindDoc="0" locked="0" layoutInCell="1" allowOverlap="1" wp14:anchorId="058A20DF" wp14:editId="499DEEB3">
+          <wp:anchor distT="0" distB="0" distL="114300" distR="114300" simplePos="0" relativeHeight="251658240" behindDoc="0" locked="0" layoutInCell="1" allowOverlap="1" wp14:anchorId="5A0C1832" wp14:editId="1D092656">
             <wp:simplePos x="0" y="0"/>
             <wp:positionH relativeFrom="column">
               <wp:posOffset>2852893</wp:posOffset>
@@ -2233,7 +2076,7 @@
                     </pic:cNvPicPr>
                   </pic:nvPicPr>
                   <pic:blipFill>
-                    <a:blip r:embed="rId9" cstate="print">
+                    <a:blip r:embed="rId12" cstate="print">
                       <a:extLst>
                         <a:ext uri="{28A0092B-C50C-407E-A947-70E740481C1C}">
                           <a14:useLocalDpi xmlns:a14="http://schemas.microsoft.com/office/drawing/2010/main" val="0"/>
@@ -2271,10 +2114,7 @@
         </w:drawing>
       </w:r>
       <w:r>
-        <w:t>SMP Negeri 2 Lamongan</w:t>
-      </w:r>
-      <w:r>
-        <w:t xml:space="preserve"> </w:t>
+        <w:t xml:space="preserve">SMP Negeri 2 Lamongan </w:t>
       </w:r>
     </w:p>
     <w:p>
@@ -2299,7 +2139,7 @@
       </w:r>
     </w:p>
     <w:sectPr>
-      <w:footerReference w:type="default" r:id="rId10"/>
+      <w:footerReference w:type="default" r:id="rId13"/>
       <w:pgSz w:w="11906" w:h="16838"/>
       <w:pgMar w:top="1701" w:right="1701" w:bottom="1701" w:left="2268" w:header="709" w:footer="709" w:gutter="0"/>
       <w:cols w:space="720"/>
@@ -2310,7 +2150,7 @@
 </file>
 
 <file path=word/endnotes.xml><?xml version="1.0" encoding="utf-8"?>
-<w:endnotes xmlns:wpc="http://schemas.microsoft.com/office/word/2010/wordprocessingCanvas" xmlns:cx="http://schemas.microsoft.com/office/drawing/2014/chartex" xmlns:cx1="http://schemas.microsoft.com/office/drawing/2015/9/8/chartex" xmlns:cx2="http://schemas.microsoft.com/office/drawing/2015/10/21/chartex" xmlns:cx3="http://schemas.microsoft.com/office/drawing/2016/5/9/chartex" xmlns:cx4="http://schemas.microsoft.com/office/drawing/2016/5/10/chartex" xmlns:cx5="http://schemas.microsoft.com/office/drawing/2016/5/11/chartex" xmlns:cx6="http://schemas.microsoft.com/office/drawing/2016/5/12/chartex" xmlns:cx7="http://schemas.microsoft.com/office/drawing/2016/5/13/chartex" xmlns:cx8="http://schemas.microsoft.com/office/drawing/2016/5/14/chartex" xmlns:mc="http://schemas.openxmlformats.org/markup-compatibility/2006" xmlns:aink="http://schemas.microsoft.com/office/drawing/2016/ink" xmlns:am3d="http://schemas.microsoft.com/office/drawing/2017/model3d" xmlns:o="urn:schemas-microsoft-com:office:office" xmlns:oel="http://schemas.microsoft.com/office/2019/extlst" xmlns:r="http://schemas.openxmlformats.org/officeDocument/2006/relationships" xmlns:m="http://schemas.openxmlformats.org/officeDocument/2006/math" xmlns:v="urn:schemas-microsoft-com:vml" xmlns:wp14="http://schemas.microsoft.com/office/word/2010/wordprocessingDrawing" xmlns:wp="http://schemas.openxmlformats.org/drawingml/2006/wordprocessingDrawing" xmlns:w10="urn:schemas-microsoft-com:office:word" xmlns:w="http://schemas.openxmlformats.org/wordprocessingml/2006/main" xmlns:w14="http://schemas.microsoft.com/office/word/2010/wordml" xmlns:w15="http://schemas.microsoft.com/office/word/2012/wordml" xmlns:w16cex="http://schemas.microsoft.com/office/word/2018/wordml/cex" xmlns:w16cid="http://schemas.microsoft.com/office/word/2016/wordml/cid" xmlns:w16="http://schemas.microsoft.com/office/word/2018/wordml" xmlns:w16du="http://schemas.microsoft.com/office/word/2023/wordml/word16du" xmlns:w16sdtdh="http://schemas.microsoft.com/office/word/2020/wordml/sdtdatahash" xmlns:w16sdtfl="http://schemas.microsoft.com/office/word/2024/wordml/sdtformatlock" xmlns:w16se="http://schemas.microsoft.com/office/word/2015/wordml/symex" xmlns:wpg="http://schemas.microsoft.com/office/word/2010/wordprocessingGroup" xmlns:wpi="http://schemas.microsoft.com/office/word/2010/wordprocessingInk" xmlns:wne="http://schemas.microsoft.com/office/word/2006/wordml" xmlns:wps="http://schemas.microsoft.com/office/word/2010/wordprocessingShape" mc:Ignorable="w14 w15 w16se w16cid w16 w16cex w16sdtdh w16sdtfl w16du wp14">
+<w:endnotes xmlns:wpc="http://schemas.microsoft.com/office/word/2010/wordprocessingCanvas" xmlns:cx="http://schemas.microsoft.com/office/drawing/2014/chartex" xmlns:cx1="http://schemas.microsoft.com/office/drawing/2015/9/8/chartex" xmlns:cx2="http://schemas.microsoft.com/office/drawing/2015/10/21/chartex" xmlns:cx3="http://schemas.microsoft.com/office/drawing/2016/5/9/chartex" xmlns:cx4="http://schemas.microsoft.com/office/drawing/2016/5/10/chartex" xmlns:cx5="http://schemas.microsoft.com/office/drawing/2016/5/11/chartex" xmlns:cx6="http://schemas.microsoft.com/office/drawing/2016/5/12/chartex" xmlns:cx7="http://schemas.microsoft.com/office/drawing/2016/5/13/chartex" xmlns:cx8="http://schemas.microsoft.com/office/drawing/2016/5/14/chartex" xmlns:mc="http://schemas.openxmlformats.org/markup-compatibility/2006" xmlns:aink="http://schemas.microsoft.com/office/drawing/2016/ink" xmlns:am3d="http://schemas.microsoft.com/office/drawing/2017/model3d" xmlns:o="urn:schemas-microsoft-com:office:office" xmlns:r="http://schemas.openxmlformats.org/officeDocument/2006/relationships" xmlns:m="http://schemas.openxmlformats.org/officeDocument/2006/math" xmlns:v="urn:schemas-microsoft-com:vml" xmlns:wp14="http://schemas.microsoft.com/office/word/2010/wordprocessingDrawing" xmlns:wp="http://schemas.openxmlformats.org/drawingml/2006/wordprocessingDrawing" xmlns:w10="urn:schemas-microsoft-com:office:word" xmlns:w="http://schemas.openxmlformats.org/wordprocessingml/2006/main" xmlns:w14="http://schemas.microsoft.com/office/word/2010/wordml" xmlns:w15="http://schemas.microsoft.com/office/word/2012/wordml" xmlns:w16cex="http://schemas.microsoft.com/office/word/2018/wordml/cex" xmlns:w16cid="http://schemas.microsoft.com/office/word/2016/wordml/cid" xmlns:w16="http://schemas.microsoft.com/office/word/2018/wordml" xmlns:w16se="http://schemas.microsoft.com/office/word/2015/wordml/symex" xmlns:wpg="http://schemas.microsoft.com/office/word/2010/wordprocessingGroup" xmlns:wpi="http://schemas.microsoft.com/office/word/2010/wordprocessingInk" xmlns:wne="http://schemas.microsoft.com/office/word/2006/wordml" xmlns:wps="http://schemas.microsoft.com/office/word/2010/wordprocessingShape" mc:Ignorable="w14 w15 w16se w16cid w16 w16cex wp14">
   <w:endnote w:type="separator" w:id="-1">
     <w:p>
       <w:pPr>
@@ -2335,7 +2175,7 @@
 </file>
 
 <file path=word/footer1.xml><?xml version="1.0" encoding="utf-8"?>
-<w:ftr xmlns:wpc="http://schemas.microsoft.com/office/word/2010/wordprocessingCanvas" xmlns:cx="http://schemas.microsoft.com/office/drawing/2014/chartex" xmlns:cx1="http://schemas.microsoft.com/office/drawing/2015/9/8/chartex" xmlns:cx2="http://schemas.microsoft.com/office/drawing/2015/10/21/chartex" xmlns:cx3="http://schemas.microsoft.com/office/drawing/2016/5/9/chartex" xmlns:cx4="http://schemas.microsoft.com/office/drawing/2016/5/10/chartex" xmlns:cx5="http://schemas.microsoft.com/office/drawing/2016/5/11/chartex" xmlns:cx6="http://schemas.microsoft.com/office/drawing/2016/5/12/chartex" xmlns:cx7="http://schemas.microsoft.com/office/drawing/2016/5/13/chartex" xmlns:cx8="http://schemas.microsoft.com/office/drawing/2016/5/14/chartex" xmlns:mc="http://schemas.openxmlformats.org/markup-compatibility/2006" xmlns:aink="http://schemas.microsoft.com/office/drawing/2016/ink" xmlns:am3d="http://schemas.microsoft.com/office/drawing/2017/model3d" xmlns:o="urn:schemas-microsoft-com:office:office" xmlns:oel="http://schemas.microsoft.com/office/2019/extlst" xmlns:r="http://schemas.openxmlformats.org/officeDocument/2006/relationships" xmlns:m="http://schemas.openxmlformats.org/officeDocument/2006/math" xmlns:v="urn:schemas-microsoft-com:vml" xmlns:wp14="http://schemas.microsoft.com/office/word/2010/wordprocessingDrawing" xmlns:wp="http://schemas.openxmlformats.org/drawingml/2006/wordprocessingDrawing" xmlns:w10="urn:schemas-microsoft-com:office:word" xmlns:w="http://schemas.openxmlformats.org/wordprocessingml/2006/main" xmlns:w14="http://schemas.microsoft.com/office/word/2010/wordml" xmlns:w15="http://schemas.microsoft.com/office/word/2012/wordml" xmlns:w16cex="http://schemas.microsoft.com/office/word/2018/wordml/cex" xmlns:w16cid="http://schemas.microsoft.com/office/word/2016/wordml/cid" xmlns:w16="http://schemas.microsoft.com/office/word/2018/wordml" xmlns:w16du="http://schemas.microsoft.com/office/word/2023/wordml/word16du" xmlns:w16sdtdh="http://schemas.microsoft.com/office/word/2020/wordml/sdtdatahash" xmlns:w16sdtfl="http://schemas.microsoft.com/office/word/2024/wordml/sdtformatlock" xmlns:w16se="http://schemas.microsoft.com/office/word/2015/wordml/symex" xmlns:wpg="http://schemas.microsoft.com/office/word/2010/wordprocessingGroup" xmlns:wpi="http://schemas.microsoft.com/office/word/2010/wordprocessingInk" xmlns:wne="http://schemas.microsoft.com/office/word/2006/wordml" xmlns:wps="http://schemas.microsoft.com/office/word/2010/wordprocessingShape" mc:Ignorable="w14 w15 w16se w16cid w16 w16cex w16sdtdh w16sdtfl w16du wp14">
+<w:ftr xmlns:wpc="http://schemas.microsoft.com/office/word/2010/wordprocessingCanvas" xmlns:cx="http://schemas.microsoft.com/office/drawing/2014/chartex" xmlns:cx1="http://schemas.microsoft.com/office/drawing/2015/9/8/chartex" xmlns:cx2="http://schemas.microsoft.com/office/drawing/2015/10/21/chartex" xmlns:cx3="http://schemas.microsoft.com/office/drawing/2016/5/9/chartex" xmlns:cx4="http://schemas.microsoft.com/office/drawing/2016/5/10/chartex" xmlns:cx5="http://schemas.microsoft.com/office/drawing/2016/5/11/chartex" xmlns:cx6="http://schemas.microsoft.com/office/drawing/2016/5/12/chartex" xmlns:cx7="http://schemas.microsoft.com/office/drawing/2016/5/13/chartex" xmlns:cx8="http://schemas.microsoft.com/office/drawing/2016/5/14/chartex" xmlns:mc="http://schemas.openxmlformats.org/markup-compatibility/2006" xmlns:aink="http://schemas.microsoft.com/office/drawing/2016/ink" xmlns:am3d="http://schemas.microsoft.com/office/drawing/2017/model3d" xmlns:o="urn:schemas-microsoft-com:office:office" xmlns:r="http://schemas.openxmlformats.org/officeDocument/2006/relationships" xmlns:m="http://schemas.openxmlformats.org/officeDocument/2006/math" xmlns:v="urn:schemas-microsoft-com:vml" xmlns:wp14="http://schemas.microsoft.com/office/word/2010/wordprocessingDrawing" xmlns:wp="http://schemas.openxmlformats.org/drawingml/2006/wordprocessingDrawing" xmlns:w10="urn:schemas-microsoft-com:office:word" xmlns:w="http://schemas.openxmlformats.org/wordprocessingml/2006/main" xmlns:w14="http://schemas.microsoft.com/office/word/2010/wordml" xmlns:w15="http://schemas.microsoft.com/office/word/2012/wordml" xmlns:w16cex="http://schemas.microsoft.com/office/word/2018/wordml/cex" xmlns:w16cid="http://schemas.microsoft.com/office/word/2016/wordml/cid" xmlns:w16="http://schemas.microsoft.com/office/word/2018/wordml" xmlns:w16se="http://schemas.microsoft.com/office/word/2015/wordml/symex" xmlns:wpg="http://schemas.microsoft.com/office/word/2010/wordprocessingGroup" xmlns:wpi="http://schemas.microsoft.com/office/word/2010/wordprocessingInk" xmlns:wne="http://schemas.microsoft.com/office/word/2006/wordml" xmlns:wps="http://schemas.microsoft.com/office/word/2010/wordprocessingShape" mc:Ignorable="w14 w15 w16se w16cid w16 w16cex wp14">
   <w:p>
     <w:pPr>
       <w:jc w:val="center"/>
@@ -2363,7 +2203,7 @@
 </file>
 
 <file path=word/footnotes.xml><?xml version="1.0" encoding="utf-8"?>
-<w:footnotes xmlns:wpc="http://schemas.microsoft.com/office/word/2010/wordprocessingCanvas" xmlns:cx="http://schemas.microsoft.com/office/drawing/2014/chartex" xmlns:cx1="http://schemas.microsoft.com/office/drawing/2015/9/8/chartex" xmlns:cx2="http://schemas.microsoft.com/office/drawing/2015/10/21/chartex" xmlns:cx3="http://schemas.microsoft.com/office/drawing/2016/5/9/chartex" xmlns:cx4="http://schemas.microsoft.com/office/drawing/2016/5/10/chartex" xmlns:cx5="http://schemas.microsoft.com/office/drawing/2016/5/11/chartex" xmlns:cx6="http://schemas.microsoft.com/office/drawing/2016/5/12/chartex" xmlns:cx7="http://schemas.microsoft.com/office/drawing/2016/5/13/chartex" xmlns:cx8="http://schemas.microsoft.com/office/drawing/2016/5/14/chartex" xmlns:mc="http://schemas.openxmlformats.org/markup-compatibility/2006" xmlns:aink="http://schemas.microsoft.com/office/drawing/2016/ink" xmlns:am3d="http://schemas.microsoft.com/office/drawing/2017/model3d" xmlns:o="urn:schemas-microsoft-com:office:office" xmlns:oel="http://schemas.microsoft.com/office/2019/extlst" xmlns:r="http://schemas.openxmlformats.org/officeDocument/2006/relationships" xmlns:m="http://schemas.openxmlformats.org/officeDocument/2006/math" xmlns:v="urn:schemas-microsoft-com:vml" xmlns:wp14="http://schemas.microsoft.com/office/word/2010/wordprocessingDrawing" xmlns:wp="http://schemas.openxmlformats.org/drawingml/2006/wordprocessingDrawing" xmlns:w10="urn:schemas-microsoft-com:office:word" xmlns:w="http://schemas.openxmlformats.org/wordprocessingml/2006/main" xmlns:w14="http://schemas.microsoft.com/office/word/2010/wordml" xmlns:w15="http://schemas.microsoft.com/office/word/2012/wordml" xmlns:w16cex="http://schemas.microsoft.com/office/word/2018/wordml/cex" xmlns:w16cid="http://schemas.microsoft.com/office/word/2016/wordml/cid" xmlns:w16="http://schemas.microsoft.com/office/word/2018/wordml" xmlns:w16du="http://schemas.microsoft.com/office/word/2023/wordml/word16du" xmlns:w16sdtdh="http://schemas.microsoft.com/office/word/2020/wordml/sdtdatahash" xmlns:w16sdtfl="http://schemas.microsoft.com/office/word/2024/wordml/sdtformatlock" xmlns:w16se="http://schemas.microsoft.com/office/word/2015/wordml/symex" xmlns:wpg="http://schemas.microsoft.com/office/word/2010/wordprocessingGroup" xmlns:wpi="http://schemas.microsoft.com/office/word/2010/wordprocessingInk" xmlns:wne="http://schemas.microsoft.com/office/word/2006/wordml" xmlns:wps="http://schemas.microsoft.com/office/word/2010/wordprocessingShape" mc:Ignorable="w14 w15 w16se w16cid w16 w16cex w16sdtdh w16sdtfl w16du wp14">
+<w:footnotes xmlns:wpc="http://schemas.microsoft.com/office/word/2010/wordprocessingCanvas" xmlns:cx="http://schemas.microsoft.com/office/drawing/2014/chartex" xmlns:cx1="http://schemas.microsoft.com/office/drawing/2015/9/8/chartex" xmlns:cx2="http://schemas.microsoft.com/office/drawing/2015/10/21/chartex" xmlns:cx3="http://schemas.microsoft.com/office/drawing/2016/5/9/chartex" xmlns:cx4="http://schemas.microsoft.com/office/drawing/2016/5/10/chartex" xmlns:cx5="http://schemas.microsoft.com/office/drawing/2016/5/11/chartex" xmlns:cx6="http://schemas.microsoft.com/office/drawing/2016/5/12/chartex" xmlns:cx7="http://schemas.microsoft.com/office/drawing/2016/5/13/chartex" xmlns:cx8="http://schemas.microsoft.com/office/drawing/2016/5/14/chartex" xmlns:mc="http://schemas.openxmlformats.org/markup-compatibility/2006" xmlns:aink="http://schemas.microsoft.com/office/drawing/2016/ink" xmlns:am3d="http://schemas.microsoft.com/office/drawing/2017/model3d" xmlns:o="urn:schemas-microsoft-com:office:office" xmlns:r="http://schemas.openxmlformats.org/officeDocument/2006/relationships" xmlns:m="http://schemas.openxmlformats.org/officeDocument/2006/math" xmlns:v="urn:schemas-microsoft-com:vml" xmlns:wp14="http://schemas.microsoft.com/office/word/2010/wordprocessingDrawing" xmlns:wp="http://schemas.openxmlformats.org/drawingml/2006/wordprocessingDrawing" xmlns:w10="urn:schemas-microsoft-com:office:word" xmlns:w="http://schemas.openxmlformats.org/wordprocessingml/2006/main" xmlns:w14="http://schemas.microsoft.com/office/word/2010/wordml" xmlns:w15="http://schemas.microsoft.com/office/word/2012/wordml" xmlns:w16cex="http://schemas.microsoft.com/office/word/2018/wordml/cex" xmlns:w16cid="http://schemas.microsoft.com/office/word/2016/wordml/cid" xmlns:w16="http://schemas.microsoft.com/office/word/2018/wordml" xmlns:w16se="http://schemas.microsoft.com/office/word/2015/wordml/symex" xmlns:wpg="http://schemas.microsoft.com/office/word/2010/wordprocessingGroup" xmlns:wpi="http://schemas.microsoft.com/office/word/2010/wordprocessingInk" xmlns:wne="http://schemas.microsoft.com/office/word/2006/wordml" xmlns:wps="http://schemas.microsoft.com/office/word/2010/wordprocessingShape" mc:Ignorable="w14 w15 w16se w16cid w16 w16cex wp14">
   <w:footnote w:type="separator" w:id="-1">
     <w:p>
       <w:pPr>
@@ -2388,7 +2228,7 @@
 </file>
 
 <file path=word/numbering.xml><?xml version="1.0" encoding="utf-8"?>
-<w:numbering xmlns:wpc="http://schemas.microsoft.com/office/word/2010/wordprocessingCanvas" xmlns:cx="http://schemas.microsoft.com/office/drawing/2014/chartex" xmlns:cx1="http://schemas.microsoft.com/office/drawing/2015/9/8/chartex" xmlns:cx2="http://schemas.microsoft.com/office/drawing/2015/10/21/chartex" xmlns:cx3="http://schemas.microsoft.com/office/drawing/2016/5/9/chartex" xmlns:cx4="http://schemas.microsoft.com/office/drawing/2016/5/10/chartex" xmlns:cx5="http://schemas.microsoft.com/office/drawing/2016/5/11/chartex" xmlns:cx6="http://schemas.microsoft.com/office/drawing/2016/5/12/chartex" xmlns:cx7="http://schemas.microsoft.com/office/drawing/2016/5/13/chartex" xmlns:cx8="http://schemas.microsoft.com/office/drawing/2016/5/14/chartex" xmlns:mc="http://schemas.openxmlformats.org/markup-compatibility/2006" xmlns:aink="http://schemas.microsoft.com/office/drawing/2016/ink" xmlns:am3d="http://schemas.microsoft.com/office/drawing/2017/model3d" xmlns:o="urn:schemas-microsoft-com:office:office" xmlns:oel="http://schemas.microsoft.com/office/2019/extlst" xmlns:r="http://schemas.openxmlformats.org/officeDocument/2006/relationships" xmlns:m="http://schemas.openxmlformats.org/officeDocument/2006/math" xmlns:v="urn:schemas-microsoft-com:vml" xmlns:wp14="http://schemas.microsoft.com/office/word/2010/wordprocessingDrawing" xmlns:wp="http://schemas.openxmlformats.org/drawingml/2006/wordprocessingDrawing" xmlns:w10="urn:schemas-microsoft-com:office:word" xmlns:w="http://schemas.openxmlformats.org/wordprocessingml/2006/main" xmlns:w14="http://schemas.microsoft.com/office/word/2010/wordml" xmlns:w15="http://schemas.microsoft.com/office/word/2012/wordml" xmlns:w16cex="http://schemas.microsoft.com/office/word/2018/wordml/cex" xmlns:w16cid="http://schemas.microsoft.com/office/word/2016/wordml/cid" xmlns:w16="http://schemas.microsoft.com/office/word/2018/wordml" xmlns:w16du="http://schemas.microsoft.com/office/word/2023/wordml/word16du" xmlns:w16sdtdh="http://schemas.microsoft.com/office/word/2020/wordml/sdtdatahash" xmlns:w16sdtfl="http://schemas.microsoft.com/office/word/2024/wordml/sdtformatlock" xmlns:w16se="http://schemas.microsoft.com/office/word/2015/wordml/symex" xmlns:wpg="http://schemas.microsoft.com/office/word/2010/wordprocessingGroup" xmlns:wpi="http://schemas.microsoft.com/office/word/2010/wordprocessingInk" xmlns:wne="http://schemas.microsoft.com/office/word/2006/wordml" xmlns:wps="http://schemas.microsoft.com/office/word/2010/wordprocessingShape" mc:Ignorable="w14 w15 w16se w16cid w16 w16cex w16sdtdh w16sdtfl w16du wp14">
+<w:numbering xmlns:wpc="http://schemas.microsoft.com/office/word/2010/wordprocessingCanvas" xmlns:cx="http://schemas.microsoft.com/office/drawing/2014/chartex" xmlns:cx1="http://schemas.microsoft.com/office/drawing/2015/9/8/chartex" xmlns:cx2="http://schemas.microsoft.com/office/drawing/2015/10/21/chartex" xmlns:cx3="http://schemas.microsoft.com/office/drawing/2016/5/9/chartex" xmlns:cx4="http://schemas.microsoft.com/office/drawing/2016/5/10/chartex" xmlns:cx5="http://schemas.microsoft.com/office/drawing/2016/5/11/chartex" xmlns:cx6="http://schemas.microsoft.com/office/drawing/2016/5/12/chartex" xmlns:cx7="http://schemas.microsoft.com/office/drawing/2016/5/13/chartex" xmlns:cx8="http://schemas.microsoft.com/office/drawing/2016/5/14/chartex" xmlns:mc="http://schemas.openxmlformats.org/markup-compatibility/2006" xmlns:aink="http://schemas.microsoft.com/office/drawing/2016/ink" xmlns:am3d="http://schemas.microsoft.com/office/drawing/2017/model3d" xmlns:o="urn:schemas-microsoft-com:office:office" xmlns:r="http://schemas.openxmlformats.org/officeDocument/2006/relationships" xmlns:m="http://schemas.openxmlformats.org/officeDocument/2006/math" xmlns:v="urn:schemas-microsoft-com:vml" xmlns:wp14="http://schemas.microsoft.com/office/word/2010/wordprocessingDrawing" xmlns:wp="http://schemas.openxmlformats.org/drawingml/2006/wordprocessingDrawing" xmlns:w10="urn:schemas-microsoft-com:office:word" xmlns:w="http://schemas.openxmlformats.org/wordprocessingml/2006/main" xmlns:w14="http://schemas.microsoft.com/office/word/2010/wordml" xmlns:w15="http://schemas.microsoft.com/office/word/2012/wordml" xmlns:w16cex="http://schemas.microsoft.com/office/word/2018/wordml/cex" xmlns:w16cid="http://schemas.microsoft.com/office/word/2016/wordml/cid" xmlns:w16="http://schemas.microsoft.com/office/word/2018/wordml" xmlns:w16se="http://schemas.microsoft.com/office/word/2015/wordml/symex" xmlns:wpg="http://schemas.microsoft.com/office/word/2010/wordprocessingGroup" xmlns:wpi="http://schemas.microsoft.com/office/word/2010/wordprocessingInk" xmlns:wne="http://schemas.microsoft.com/office/word/2006/wordml" xmlns:wps="http://schemas.microsoft.com/office/word/2010/wordprocessingShape" mc:Ignorable="w14 w15 w16se w16cid w16 w16cex wp14">
   <w:abstractNum w:abstractNumId="0" w15:restartNumberingAfterBreak="0">
     <w:nsid w:val="5BB03DA7"/>
     <w:multiLevelType w:val="hybridMultilevel"/>
@@ -2534,13 +2374,13 @@
       <w:lvlJc w:val="left"/>
     </w:lvl>
   </w:abstractNum>
-  <w:num w:numId="1" w16cid:durableId="59984491">
+  <w:num w:numId="1">
     <w:abstractNumId w:val="0"/>
     <w:lvlOverride w:ilvl="0">
       <w:startOverride w:val="1"/>
     </w:lvlOverride>
   </w:num>
-  <w:num w:numId="2" w16cid:durableId="391972253">
+  <w:num w:numId="2">
     <w:abstractNumId w:val="1"/>
     <w:lvlOverride w:ilvl="0">
       <w:startOverride w:val="1"/>
@@ -2550,7 +2390,7 @@
 </file>
 
 <file path=word/styles.xml><?xml version="1.0" encoding="utf-8"?>
-<w:styles xmlns:mc="http://schemas.openxmlformats.org/markup-compatibility/2006" xmlns:r="http://schemas.openxmlformats.org/officeDocument/2006/relationships" xmlns:w="http://schemas.openxmlformats.org/wordprocessingml/2006/main" xmlns:w14="http://schemas.microsoft.com/office/word/2010/wordml" xmlns:w15="http://schemas.microsoft.com/office/word/2012/wordml" xmlns:w16cex="http://schemas.microsoft.com/office/word/2018/wordml/cex" xmlns:w16cid="http://schemas.microsoft.com/office/word/2016/wordml/cid" xmlns:w16="http://schemas.microsoft.com/office/word/2018/wordml" xmlns:w16du="http://schemas.microsoft.com/office/word/2023/wordml/word16du" xmlns:w16sdtdh="http://schemas.microsoft.com/office/word/2020/wordml/sdtdatahash" xmlns:w16sdtfl="http://schemas.microsoft.com/office/word/2024/wordml/sdtformatlock" xmlns:w16se="http://schemas.microsoft.com/office/word/2015/wordml/symex" mc:Ignorable="w14 w15 w16se w16cid w16 w16cex w16sdtdh w16sdtfl w16du">
+<w:styles xmlns:mc="http://schemas.openxmlformats.org/markup-compatibility/2006" xmlns:r="http://schemas.openxmlformats.org/officeDocument/2006/relationships" xmlns:w="http://schemas.openxmlformats.org/wordprocessingml/2006/main" xmlns:w14="http://schemas.microsoft.com/office/word/2010/wordml" xmlns:w15="http://schemas.microsoft.com/office/word/2012/wordml" xmlns:w16cex="http://schemas.microsoft.com/office/word/2018/wordml/cex" xmlns:w16cid="http://schemas.microsoft.com/office/word/2016/wordml/cid" xmlns:w16="http://schemas.microsoft.com/office/word/2018/wordml" xmlns:w16se="http://schemas.microsoft.com/office/word/2015/wordml/symex" mc:Ignorable="w14 w15 w16se w16cid w16 w16cex">
   <w:docDefaults>
     <w:rPrDefault>
       <w:rPr>
@@ -3154,6 +2994,18 @@
       <w:szCs w:val="20"/>
     </w:rPr>
   </w:style>
+  <w:style w:type="character" w:styleId="UnresolvedMention">
+    <w:name w:val="Unresolved Mention"/>
+    <w:basedOn w:val="DefaultParagraphFont"/>
+    <w:uiPriority w:val="99"/>
+    <w:semiHidden/>
+    <w:unhideWhenUsed/>
+    <w:rsid w:val="002622FA"/>
+    <w:rPr>
+      <w:color w:val="605E5C"/>
+      <w:shd w:val="clear" w:color="auto" w:fill="E1DFDD"/>
+    </w:rPr>
+  </w:style>
 </w:styles>
 </file>
 

</xml_diff>